<commit_message>
add business logic documents and images
</commit_message>
<xml_diff>
--- a/Business Logic Documents/D2 - Dimensional SPC/D2 — Judgement by ISC Code done.docx
+++ b/Business Logic Documents/D2 - Dimensional SPC/D2 — Judgement by ISC Code done.docx
@@ -21,20 +21,8 @@
           <w:sz w:val="36"/>
           <w:szCs w:val="40"/>
         </w:rPr>
-        <w:t xml:space="preserve">Business Logic Prompt each </w:t>
-      </w:r>
-      <w:proofErr w:type="gramStart"/>
-      <w:r>
-        <w:rPr>
-          <w:b/>
-          <w:bCs/>
-          <w:color w:val="FF9933"/>
-          <w:sz w:val="36"/>
-          <w:szCs w:val="40"/>
-        </w:rPr>
-        <w:t>dashboards</w:t>
-      </w:r>
-      <w:proofErr w:type="gramEnd"/>
+        <w:t>Business Logic Prompt each dashboards</w:t>
+      </w:r>
     </w:p>
     <w:p>
       <w:pPr>
@@ -112,45 +100,25 @@
           <w:sz w:val="28"/>
           <w:szCs w:val="28"/>
         </w:rPr>
+        <w:t xml:space="preserve"> — </w:t>
+      </w:r>
+      <w:r>
+        <w:rPr>
+          <w:b/>
+          <w:bCs/>
+          <w:sz w:val="28"/>
+          <w:szCs w:val="28"/>
+        </w:rPr>
         <w:t xml:space="preserve"> </w:t>
       </w:r>
-      <w:proofErr w:type="gramStart"/>
-      <w:r>
-        <w:rPr>
-          <w:b/>
-          <w:bCs/>
-          <w:sz w:val="28"/>
-          <w:szCs w:val="28"/>
-        </w:rPr>
-        <w:t xml:space="preserve">— </w:t>
-      </w:r>
-      <w:r>
-        <w:rPr>
-          <w:b/>
-          <w:bCs/>
-          <w:sz w:val="28"/>
-          <w:szCs w:val="28"/>
-        </w:rPr>
-        <w:t xml:space="preserve"> </w:t>
-      </w:r>
-      <w:r>
-        <w:rPr>
-          <w:b/>
-          <w:bCs/>
-          <w:sz w:val="28"/>
-          <w:szCs w:val="28"/>
-        </w:rPr>
-        <w:t>Dimensional</w:t>
-      </w:r>
-      <w:proofErr w:type="gramEnd"/>
-      <w:r>
-        <w:rPr>
-          <w:b/>
-          <w:bCs/>
-          <w:sz w:val="28"/>
-          <w:szCs w:val="28"/>
-        </w:rPr>
-        <w:t xml:space="preserve"> SPC</w:t>
+      <w:r>
+        <w:rPr>
+          <w:b/>
+          <w:bCs/>
+          <w:sz w:val="28"/>
+          <w:szCs w:val="28"/>
+        </w:rPr>
+        <w:t>Dimensional SPC</w:t>
       </w:r>
     </w:p>
     <w:p>
@@ -178,36 +146,16 @@
           <w:sz w:val="28"/>
           <w:szCs w:val="28"/>
         </w:rPr>
-        <w:t>.Dashboard</w:t>
-      </w:r>
-      <w:proofErr w:type="gramStart"/>
-      <w:r>
-        <w:rPr>
-          <w:b/>
-          <w:bCs/>
-          <w:sz w:val="28"/>
-          <w:szCs w:val="28"/>
-        </w:rPr>
-        <w:t xml:space="preserve">:  </w:t>
-      </w:r>
-      <w:r>
-        <w:rPr>
-          <w:b/>
-          <w:bCs/>
-          <w:sz w:val="28"/>
-          <w:szCs w:val="28"/>
-        </w:rPr>
-        <w:t>JUDGEMENT</w:t>
-      </w:r>
-      <w:proofErr w:type="gramEnd"/>
-      <w:r>
-        <w:rPr>
-          <w:b/>
-          <w:bCs/>
-          <w:sz w:val="28"/>
-          <w:szCs w:val="28"/>
-        </w:rPr>
-        <w:t xml:space="preserve"> BY ISC CODE</w:t>
+        <w:t xml:space="preserve">.Dashboard:  </w:t>
+      </w:r>
+      <w:r>
+        <w:rPr>
+          <w:b/>
+          <w:bCs/>
+          <w:sz w:val="28"/>
+          <w:szCs w:val="28"/>
+        </w:rPr>
+        <w:t>JUDGEMENT BY ISC CODE</w:t>
       </w:r>
     </w:p>
     <w:p>
@@ -345,6 +293,37 @@
         </w:rPr>
         <w:t>ความหมาย</w:t>
       </w:r>
+      <w:r>
+        <w:rPr>
+          <w:rFonts w:hint="cs"/>
+          <w:b/>
+          <w:bCs/>
+          <w:sz w:val="28"/>
+          <w:szCs w:val="28"/>
+          <w:cs/>
+        </w:rPr>
+        <w:t xml:space="preserve">ของ </w:t>
+      </w:r>
+      <w:r>
+        <w:rPr>
+          <w:rFonts w:hint="cs"/>
+          <w:b/>
+          <w:bCs/>
+          <w:sz w:val="28"/>
+          <w:szCs w:val="28"/>
+          <w:cs/>
+        </w:rPr>
+        <w:t xml:space="preserve"> </w:t>
+      </w:r>
+      <w:r>
+        <w:rPr>
+          <w:b/>
+          <w:bCs/>
+          <w:sz w:val="28"/>
+          <w:szCs w:val="28"/>
+        </w:rPr>
+        <w:t>Judgement by ISC Code</w:t>
+      </w:r>
     </w:p>
     <w:p>
       <w:pPr>
@@ -621,6 +600,26 @@
           <w:cs/>
         </w:rPr>
         <w:t>วัตถุประสงค์</w:t>
+      </w:r>
+      <w:r>
+        <w:rPr>
+          <w:rFonts w:hint="cs"/>
+          <w:b/>
+          <w:bCs/>
+          <w:sz w:val="28"/>
+          <w:szCs w:val="28"/>
+          <w:cs/>
+        </w:rPr>
+        <w:t xml:space="preserve">ของ </w:t>
+      </w:r>
+      <w:r>
+        <w:rPr>
+          <w:b/>
+          <w:bCs/>
+          <w:sz w:val="28"/>
+          <w:szCs w:val="28"/>
+        </w:rPr>
+        <w:t>Judgement by ISC Code</w:t>
       </w:r>
     </w:p>
     <w:p>
@@ -2587,21 +2586,12 @@
         </w:rPr>
         <w:t xml:space="preserve">มีค่า (ค่าต้องไม่ว่าง ยกตัวอย่าง เช่น </w:t>
       </w:r>
-      <w:proofErr w:type="gramStart"/>
-      <w:r>
-        <w:rPr>
-          <w:sz w:val="28"/>
-          <w:szCs w:val="28"/>
-        </w:rPr>
-        <w:t>A,B</w:t>
-      </w:r>
-      <w:proofErr w:type="gramEnd"/>
-      <w:r>
-        <w:rPr>
-          <w:sz w:val="28"/>
-          <w:szCs w:val="28"/>
-        </w:rPr>
-        <w:t>,C, …</w:t>
+      <w:r>
+        <w:rPr>
+          <w:sz w:val="28"/>
+          <w:szCs w:val="28"/>
+        </w:rPr>
+        <w:t>A,B,C, …</w:t>
       </w:r>
       <w:r>
         <w:rPr>
@@ -2630,23 +2620,7 @@
           <w:sz w:val="28"/>
           <w:szCs w:val="28"/>
         </w:rPr>
-        <w:t>Judgement         =</w:t>
-      </w:r>
-      <w:proofErr w:type="gramStart"/>
-      <w:r>
-        <w:rPr>
-          <w:sz w:val="28"/>
-          <w:szCs w:val="28"/>
-        </w:rPr>
-        <w:t xml:space="preserve">   ‘</w:t>
-      </w:r>
-      <w:proofErr w:type="gramEnd"/>
-      <w:r>
-        <w:rPr>
-          <w:sz w:val="28"/>
-          <w:szCs w:val="28"/>
-        </w:rPr>
-        <w:t xml:space="preserve">X’ </w:t>
+        <w:t xml:space="preserve">Judgement         =   ‘X’ </w:t>
       </w:r>
       <w:r>
         <w:rPr>
@@ -2725,7 +2699,6 @@
         </w:rPr>
         <w:t xml:space="preserve">1 </w:t>
       </w:r>
-      <w:proofErr w:type="gramStart"/>
       <w:r>
         <w:rPr>
           <w:rFonts w:hint="cs"/>
@@ -2749,17 +2722,7 @@
           <w:szCs w:val="28"/>
           <w:cs/>
         </w:rPr>
-        <w:t>เท่ากับ</w:t>
-      </w:r>
-      <w:proofErr w:type="gramEnd"/>
-      <w:r>
-        <w:rPr>
-          <w:rFonts w:hint="cs"/>
-          <w:sz w:val="28"/>
-          <w:szCs w:val="28"/>
-          <w:cs/>
-        </w:rPr>
-        <w:t xml:space="preserve"> </w:t>
+        <w:t xml:space="preserve">เท่ากับ </w:t>
       </w:r>
       <w:r>
         <w:rPr>
@@ -6265,7 +6228,6 @@
                                 <w:szCs w:val="24"/>
                               </w:rPr>
                             </w:pPr>
-                            <w:proofErr w:type="gramStart"/>
                             <w:r>
                               <w:rPr>
                                 <w:b/>
@@ -6282,18 +6244,7 @@
                                 <w:szCs w:val="24"/>
                                 <w:cs/>
                               </w:rPr>
-                              <w:t>มีค่า</w:t>
-                            </w:r>
-                            <w:proofErr w:type="gramEnd"/>
-                            <w:r>
-                              <w:rPr>
-                                <w:rFonts w:hint="cs"/>
-                                <w:b/>
-                                <w:bCs/>
-                                <w:szCs w:val="24"/>
-                                <w:cs/>
-                              </w:rPr>
-                              <w:t xml:space="preserve"> (ไม่ว่าง) </w:t>
+                              <w:t xml:space="preserve">มีค่า (ไม่ว่าง) </w:t>
                             </w:r>
                           </w:p>
                           <w:p>
@@ -6468,7 +6419,6 @@
                           <w:szCs w:val="24"/>
                         </w:rPr>
                       </w:pPr>
-                      <w:proofErr w:type="gramStart"/>
                       <w:r>
                         <w:rPr>
                           <w:b/>
@@ -6485,18 +6435,7 @@
                           <w:szCs w:val="24"/>
                           <w:cs/>
                         </w:rPr>
-                        <w:t>มีค่า</w:t>
-                      </w:r>
-                      <w:proofErr w:type="gramEnd"/>
-                      <w:r>
-                        <w:rPr>
-                          <w:rFonts w:hint="cs"/>
-                          <w:b/>
-                          <w:bCs/>
-                          <w:szCs w:val="24"/>
-                          <w:cs/>
-                        </w:rPr>
-                        <w:t xml:space="preserve"> (ไม่ว่าง) </w:t>
+                        <w:t xml:space="preserve">มีค่า (ไม่ว่าง) </w:t>
                       </w:r>
                     </w:p>
                     <w:p>
@@ -7696,12 +7635,21 @@
       </w:r>
       <w:r>
         <w:rPr>
+          <w:rFonts w:hint="cs"/>
           <w:noProof/>
           <w:sz w:val="28"/>
           <w:szCs w:val="28"/>
           <w:cs/>
         </w:rPr>
-        <w:t>ใดสร้างชิ้น</w:t>
+        <w:t xml:space="preserve">โดยหา </w:t>
+      </w:r>
+      <w:r>
+        <w:rPr>
+          <w:noProof/>
+          <w:sz w:val="28"/>
+          <w:szCs w:val="28"/>
+        </w:rPr>
+        <w:t xml:space="preserve">Lot </w:t>
       </w:r>
       <w:r>
         <w:rPr>
@@ -7711,7 +7659,7 @@
           <w:szCs w:val="28"/>
           <w:cs/>
         </w:rPr>
-        <w:t xml:space="preserve">งานที่มี ค่า </w:t>
+        <w:t xml:space="preserve">ที่มี ค่า </w:t>
       </w:r>
       <w:r>
         <w:rPr>
@@ -8290,34 +8238,497 @@
     <w:p>
       <w:pPr>
         <w:rPr>
+          <w:noProof/>
+          <w:sz w:val="28"/>
+          <w:szCs w:val="28"/>
+          <w:cs/>
+        </w:rPr>
+      </w:pPr>
+    </w:p>
+    <w:p>
+      <w:pPr>
+        <w:rPr>
+          <w:b/>
+          <w:bCs/>
+          <w:sz w:val="28"/>
+          <w:szCs w:val="28"/>
+        </w:rPr>
+      </w:pPr>
+      <w:r>
+        <w:rPr>
+          <w:b/>
+          <w:bCs/>
+          <w:sz w:val="28"/>
+          <w:szCs w:val="28"/>
+        </w:rPr>
+        <w:lastRenderedPageBreak/>
+        <w:t>2.1.</w:t>
+      </w:r>
+      <w:r>
+        <w:rPr>
+          <w:b/>
+          <w:bCs/>
+          <w:sz w:val="28"/>
+          <w:szCs w:val="28"/>
+        </w:rPr>
+        <w:t>7</w:t>
+      </w:r>
+      <w:r>
+        <w:rPr>
+          <w:b/>
+          <w:bCs/>
+          <w:sz w:val="28"/>
+          <w:szCs w:val="28"/>
+        </w:rPr>
+        <w:t xml:space="preserve"> </w:t>
+      </w:r>
+      <w:r>
+        <w:rPr>
+          <w:rFonts w:cs="Cordia New" w:hint="cs"/>
+          <w:b/>
+          <w:bCs/>
+          <w:sz w:val="28"/>
+          <w:szCs w:val="28"/>
+          <w:cs/>
+        </w:rPr>
+        <w:t>วิธีการ</w:t>
+      </w:r>
+      <w:r>
+        <w:rPr>
+          <w:rFonts w:cs="Cordia New" w:hint="cs"/>
+          <w:b/>
+          <w:bCs/>
+          <w:sz w:val="28"/>
+          <w:szCs w:val="28"/>
+          <w:cs/>
+        </w:rPr>
+        <w:t>อ่าน</w:t>
+      </w:r>
+      <w:r>
+        <w:rPr>
+          <w:rFonts w:cs="Cordia New" w:hint="cs"/>
+          <w:b/>
+          <w:bCs/>
+          <w:sz w:val="28"/>
+          <w:szCs w:val="28"/>
+          <w:cs/>
+        </w:rPr>
+        <w:t>ผลลัพธ์</w:t>
+      </w:r>
+      <w:r>
+        <w:rPr>
+          <w:rFonts w:cs="Cordia New" w:hint="cs"/>
+          <w:b/>
+          <w:bCs/>
+          <w:sz w:val="28"/>
+          <w:szCs w:val="28"/>
+          <w:cs/>
+        </w:rPr>
+        <w:t xml:space="preserve">ของ </w:t>
+      </w:r>
+      <w:r>
+        <w:rPr>
+          <w:b/>
+          <w:bCs/>
+          <w:sz w:val="28"/>
+          <w:szCs w:val="28"/>
+        </w:rPr>
+        <w:t>JUDGEMENT BY ISC CODE</w:t>
+      </w:r>
+    </w:p>
+    <w:p>
+      <w:pPr>
+        <w:rPr>
+          <w:sz w:val="28"/>
+          <w:szCs w:val="28"/>
+        </w:rPr>
+      </w:pPr>
+      <w:r>
+        <w:rPr>
+          <w:sz w:val="28"/>
+          <w:szCs w:val="28"/>
+        </w:rPr>
+        <w:t xml:space="preserve">- </w:t>
+      </w:r>
+      <w:r>
+        <w:rPr>
+          <w:sz w:val="28"/>
+          <w:szCs w:val="28"/>
+          <w:cs/>
+        </w:rPr>
+        <w:t xml:space="preserve">แกน </w:t>
+      </w:r>
+      <w:r>
+        <w:rPr>
+          <w:sz w:val="28"/>
+          <w:szCs w:val="28"/>
+        </w:rPr>
+        <w:t>X (</w:t>
+      </w:r>
+      <w:r>
+        <w:rPr>
+          <w:sz w:val="28"/>
+          <w:szCs w:val="28"/>
+          <w:cs/>
+        </w:rPr>
+        <w:t>แนวนอน</w:t>
+      </w:r>
+      <w:r>
+        <w:rPr>
+          <w:sz w:val="28"/>
+          <w:szCs w:val="28"/>
+        </w:rPr>
+        <w:t>)</w:t>
+      </w:r>
+      <w:r>
+        <w:rPr>
+          <w:sz w:val="28"/>
+          <w:szCs w:val="28"/>
+          <w:cs/>
+        </w:rPr>
+        <w:t>:</w:t>
+      </w:r>
+      <w:r>
+        <w:rPr>
+          <w:sz w:val="28"/>
+          <w:szCs w:val="28"/>
+        </w:rPr>
+        <w:t xml:space="preserve"> </w:t>
+      </w:r>
+      <w:r>
+        <w:rPr>
+          <w:sz w:val="28"/>
+          <w:szCs w:val="28"/>
+          <w:cs/>
+        </w:rPr>
+        <w:t xml:space="preserve">แสดง "รหัส </w:t>
+      </w:r>
+      <w:r>
+        <w:rPr>
+          <w:sz w:val="28"/>
+          <w:szCs w:val="28"/>
+        </w:rPr>
+        <w:t xml:space="preserve">ISC" </w:t>
+      </w:r>
+      <w:r>
+        <w:rPr>
+          <w:sz w:val="28"/>
+          <w:szCs w:val="28"/>
+          <w:cs/>
+        </w:rPr>
+        <w:t>ซึ่งหมายถึง รหัสจุดวัดมิติชิ้นงานแต่ละจุด</w:t>
+      </w:r>
+    </w:p>
+    <w:p>
+      <w:pPr>
+        <w:rPr>
+          <w:sz w:val="28"/>
+          <w:szCs w:val="28"/>
+        </w:rPr>
+      </w:pPr>
+      <w:r>
+        <w:rPr>
+          <w:sz w:val="28"/>
+          <w:szCs w:val="28"/>
+        </w:rPr>
+        <w:t xml:space="preserve">- </w:t>
+      </w:r>
+      <w:r>
+        <w:rPr>
+          <w:sz w:val="28"/>
+          <w:szCs w:val="28"/>
+          <w:cs/>
+        </w:rPr>
+        <w:t xml:space="preserve">แกน </w:t>
+      </w:r>
+      <w:r>
+        <w:rPr>
+          <w:sz w:val="28"/>
+          <w:szCs w:val="28"/>
+        </w:rPr>
+        <w:t>Y (</w:t>
+      </w:r>
+      <w:r>
+        <w:rPr>
+          <w:sz w:val="28"/>
+          <w:szCs w:val="28"/>
+          <w:cs/>
+        </w:rPr>
+        <w:t>แนวตั้ง</w:t>
+      </w:r>
+      <w:r>
+        <w:rPr>
+          <w:sz w:val="28"/>
+          <w:szCs w:val="28"/>
+        </w:rPr>
+        <w:t>)</w:t>
+      </w:r>
+      <w:r>
+        <w:rPr>
+          <w:sz w:val="28"/>
+          <w:szCs w:val="28"/>
+          <w:cs/>
+        </w:rPr>
+        <w:t>:</w:t>
+      </w:r>
+      <w:r>
+        <w:rPr>
+          <w:sz w:val="28"/>
+          <w:szCs w:val="28"/>
+        </w:rPr>
+        <w:t xml:space="preserve"> </w:t>
+      </w:r>
+      <w:r>
+        <w:rPr>
+          <w:sz w:val="28"/>
+          <w:szCs w:val="28"/>
+          <w:cs/>
+        </w:rPr>
+        <w:t>แสดง</w:t>
+      </w:r>
+      <w:r>
+        <w:rPr>
+          <w:sz w:val="28"/>
+          <w:szCs w:val="28"/>
+          <w:cs/>
+        </w:rPr>
+        <w:t xml:space="preserve">จำนวนของค่า </w:t>
+      </w:r>
+      <w:r>
+        <w:rPr>
+          <w:sz w:val="28"/>
+          <w:szCs w:val="28"/>
+        </w:rPr>
+        <w:t xml:space="preserve">Judgement </w:t>
+      </w:r>
+      <w:r>
+        <w:rPr>
+          <w:sz w:val="28"/>
+          <w:szCs w:val="28"/>
+          <w:cs/>
+        </w:rPr>
+        <w:t xml:space="preserve">ที่มีค่าเท่ากับ </w:t>
+      </w:r>
+      <w:r>
+        <w:rPr>
+          <w:sz w:val="28"/>
+          <w:szCs w:val="28"/>
+        </w:rPr>
+        <w:t>'X'</w:t>
+      </w:r>
+    </w:p>
+    <w:p>
+      <w:pPr>
+        <w:rPr>
+          <w:sz w:val="28"/>
+          <w:szCs w:val="28"/>
+        </w:rPr>
+      </w:pPr>
+      <w:r>
+        <w:rPr>
+          <w:sz w:val="28"/>
+          <w:szCs w:val="28"/>
+        </w:rPr>
+        <w:t xml:space="preserve">- </w:t>
+      </w:r>
+      <w:r>
+        <w:rPr>
+          <w:sz w:val="28"/>
+          <w:szCs w:val="28"/>
+          <w:cs/>
+        </w:rPr>
+        <w:t xml:space="preserve">แท่งกราฟ </w:t>
+      </w:r>
+      <w:r>
+        <w:rPr>
+          <w:sz w:val="28"/>
+          <w:szCs w:val="28"/>
+        </w:rPr>
+        <w:t xml:space="preserve">(Bars): </w:t>
+      </w:r>
+      <w:r>
+        <w:rPr>
+          <w:sz w:val="28"/>
+          <w:szCs w:val="28"/>
+          <w:cs/>
+        </w:rPr>
+        <w:t xml:space="preserve">จะแสดงผลเรียงลำดับจากจุดที่มีจำนวน </w:t>
+      </w:r>
+      <w:r>
+        <w:rPr>
+          <w:sz w:val="28"/>
+          <w:szCs w:val="28"/>
+        </w:rPr>
+        <w:t xml:space="preserve">NG </w:t>
+      </w:r>
+      <w:r>
+        <w:rPr>
+          <w:sz w:val="28"/>
+          <w:szCs w:val="28"/>
+          <w:cs/>
+        </w:rPr>
+        <w:t>มากที่สุดไปยังจุดที่มีน้อยที่สุด (เรียงจากมากไปน้อย)</w:t>
+      </w:r>
+    </w:p>
+    <w:p>
+      <w:pPr>
+        <w:rPr>
+          <w:sz w:val="28"/>
+          <w:szCs w:val="28"/>
+        </w:rPr>
+      </w:pPr>
+      <w:r>
+        <w:rPr>
+          <w:sz w:val="28"/>
+          <w:szCs w:val="28"/>
+        </w:rPr>
+        <w:t xml:space="preserve">- </w:t>
+      </w:r>
+      <w:r>
+        <w:rPr>
+          <w:sz w:val="28"/>
+          <w:szCs w:val="28"/>
+          <w:cs/>
+        </w:rPr>
+        <w:t xml:space="preserve">แถบข้อมูลเมื่อชี้เมาส์ </w:t>
+      </w:r>
+      <w:r>
+        <w:rPr>
+          <w:sz w:val="28"/>
+          <w:szCs w:val="28"/>
+        </w:rPr>
+        <w:t>(</w:t>
+      </w:r>
+      <w:r>
+        <w:rPr>
+          <w:sz w:val="28"/>
+          <w:szCs w:val="28"/>
+        </w:rPr>
+        <w:t xml:space="preserve">Tooltip): </w:t>
+      </w:r>
+      <w:r>
+        <w:rPr>
+          <w:sz w:val="28"/>
+          <w:szCs w:val="28"/>
+          <w:cs/>
+        </w:rPr>
+        <w:t>จะแสดงรายละเอียดเจาะลึก (</w:t>
+      </w:r>
+      <w:r>
+        <w:rPr>
+          <w:sz w:val="28"/>
+          <w:szCs w:val="28"/>
+        </w:rPr>
+        <w:t xml:space="preserve">Breakdown) </w:t>
+      </w:r>
+      <w:r>
+        <w:rPr>
+          <w:sz w:val="28"/>
+          <w:szCs w:val="28"/>
+          <w:cs/>
+        </w:rPr>
+        <w:t xml:space="preserve">แยกตาม </w:t>
+      </w:r>
+      <w:r>
+        <w:rPr>
+          <w:sz w:val="28"/>
+          <w:szCs w:val="28"/>
+        </w:rPr>
+        <w:t>Cavity</w:t>
+      </w:r>
+      <w:r>
+        <w:rPr>
+          <w:sz w:val="28"/>
+          <w:szCs w:val="28"/>
+        </w:rPr>
+        <w:t xml:space="preserve">  </w:t>
+      </w:r>
+      <w:r>
+        <w:rPr>
+          <w:sz w:val="28"/>
+          <w:szCs w:val="28"/>
+          <w:cs/>
+        </w:rPr>
+        <w:t>เพื่อให้ทราบว่า</w:t>
+      </w:r>
+      <w:r>
+        <w:rPr>
+          <w:sz w:val="28"/>
+          <w:szCs w:val="28"/>
+        </w:rPr>
+        <w:t xml:space="preserve"> NG </w:t>
+      </w:r>
+      <w:r>
+        <w:rPr>
+          <w:sz w:val="28"/>
+          <w:szCs w:val="28"/>
+          <w:cs/>
+        </w:rPr>
+        <w:t xml:space="preserve">ใน </w:t>
+      </w:r>
+      <w:r>
+        <w:rPr>
+          <w:sz w:val="28"/>
+          <w:szCs w:val="28"/>
+        </w:rPr>
+        <w:t xml:space="preserve">ISC </w:t>
+      </w:r>
+      <w:r>
+        <w:rPr>
+          <w:sz w:val="28"/>
+          <w:szCs w:val="28"/>
+          <w:cs/>
+        </w:rPr>
+        <w:t xml:space="preserve">นั้นๆ เกิดขึ้นที่ </w:t>
+      </w:r>
+      <w:r>
+        <w:rPr>
+          <w:sz w:val="28"/>
+          <w:szCs w:val="28"/>
+        </w:rPr>
+        <w:t>Cavity</w:t>
+      </w:r>
+      <w:r>
+        <w:rPr>
+          <w:sz w:val="28"/>
+          <w:szCs w:val="28"/>
+        </w:rPr>
+        <w:t xml:space="preserve"> </w:t>
+      </w:r>
+      <w:r>
+        <w:rPr>
+          <w:sz w:val="28"/>
+          <w:szCs w:val="28"/>
+          <w:cs/>
+        </w:rPr>
+        <w:t>ใดบ้าง</w:t>
+      </w:r>
+    </w:p>
+    <w:p>
+      <w:pPr>
+        <w:rPr>
+          <w:noProof/>
+          <w:sz w:val="28"/>
+          <w:szCs w:val="28"/>
+        </w:rPr>
+      </w:pPr>
+      <w:r>
+        <w:rPr>
+          <w:noProof/>
+          <w:sz w:val="28"/>
+          <w:szCs w:val="28"/>
+        </w:rPr>
+        <w:t>-</w:t>
+      </w:r>
+      <w:r>
+        <w:rPr>
           <w:rFonts w:hint="cs"/>
           <w:noProof/>
           <w:sz w:val="28"/>
           <w:szCs w:val="28"/>
           <w:cs/>
         </w:rPr>
-      </w:pPr>
-    </w:p>
-    <w:p>
-      <w:pPr>
-        <w:rPr>
-          <w:b/>
-          <w:bCs/>
-          <w:noProof/>
-          <w:sz w:val="28"/>
-          <w:szCs w:val="28"/>
-        </w:rPr>
-      </w:pPr>
-      <w:r>
-        <w:rPr>
-          <w:b/>
-          <w:bCs/>
-          <w:noProof/>
-          <w:sz w:val="28"/>
-          <w:szCs w:val="28"/>
-        </w:rPr>
-        <w:lastRenderedPageBreak/>
-        <w:t xml:space="preserve">2.1.7 </w:t>
+        <w:t xml:space="preserve"> </w:t>
       </w:r>
       <w:r>
         <w:rPr>
@@ -8328,6 +8739,142 @@
           <w:szCs w:val="28"/>
           <w:cs/>
         </w:rPr>
+        <w:t xml:space="preserve">กราฟนี้จะทำการนับเฉพาะชิ้นงานที่มีผลการตรวจ </w:t>
+      </w:r>
+      <w:r>
+        <w:rPr>
+          <w:b/>
+          <w:bCs/>
+          <w:noProof/>
+          <w:sz w:val="28"/>
+          <w:szCs w:val="28"/>
+        </w:rPr>
+        <w:t>(</w:t>
+      </w:r>
+      <w:r>
+        <w:rPr>
+          <w:b/>
+          <w:bCs/>
+          <w:noProof/>
+          <w:sz w:val="28"/>
+          <w:szCs w:val="28"/>
+        </w:rPr>
+        <w:t xml:space="preserve">Judgement) </w:t>
+      </w:r>
+      <w:r>
+        <w:rPr>
+          <w:b/>
+          <w:bCs/>
+          <w:noProof/>
+          <w:sz w:val="28"/>
+          <w:szCs w:val="28"/>
+          <w:cs/>
+        </w:rPr>
+        <w:t xml:space="preserve">เป็นค่า </w:t>
+      </w:r>
+      <w:r>
+        <w:rPr>
+          <w:b/>
+          <w:bCs/>
+          <w:noProof/>
+          <w:sz w:val="28"/>
+          <w:szCs w:val="28"/>
+        </w:rPr>
+        <w:t>'X' (</w:t>
+      </w:r>
+      <w:r>
+        <w:rPr>
+          <w:b/>
+          <w:bCs/>
+          <w:noProof/>
+          <w:sz w:val="28"/>
+          <w:szCs w:val="28"/>
+          <w:cs/>
+        </w:rPr>
+        <w:t>ไม่ผ่านเกณฑ์</w:t>
+      </w:r>
+      <w:r>
+        <w:rPr>
+          <w:b/>
+          <w:bCs/>
+          <w:noProof/>
+          <w:sz w:val="28"/>
+          <w:szCs w:val="28"/>
+        </w:rPr>
+        <w:t>)</w:t>
+      </w:r>
+      <w:r>
+        <w:rPr>
+          <w:b/>
+          <w:bCs/>
+          <w:noProof/>
+          <w:sz w:val="28"/>
+          <w:szCs w:val="28"/>
+          <w:cs/>
+        </w:rPr>
+        <w:t xml:space="preserve"> เท่านั้น</w:t>
+      </w:r>
+    </w:p>
+    <w:p>
+      <w:pPr>
+        <w:rPr>
+          <w:b/>
+          <w:bCs/>
+          <w:noProof/>
+          <w:sz w:val="28"/>
+          <w:szCs w:val="28"/>
+        </w:rPr>
+      </w:pPr>
+    </w:p>
+    <w:p>
+      <w:pPr>
+        <w:rPr>
+          <w:b/>
+          <w:bCs/>
+          <w:noProof/>
+          <w:sz w:val="28"/>
+          <w:szCs w:val="28"/>
+        </w:rPr>
+      </w:pPr>
+      <w:r>
+        <w:rPr>
+          <w:b/>
+          <w:bCs/>
+          <w:noProof/>
+          <w:sz w:val="28"/>
+          <w:szCs w:val="28"/>
+        </w:rPr>
+        <w:t>2.1.</w:t>
+      </w:r>
+      <w:r>
+        <w:rPr>
+          <w:b/>
+          <w:bCs/>
+          <w:noProof/>
+          <w:sz w:val="28"/>
+          <w:szCs w:val="28"/>
+        </w:rPr>
+        <w:t>8</w:t>
+      </w:r>
+      <w:r>
+        <w:rPr>
+          <w:b/>
+          <w:bCs/>
+          <w:noProof/>
+          <w:sz w:val="28"/>
+          <w:szCs w:val="28"/>
+        </w:rPr>
+        <w:t xml:space="preserve"> </w:t>
+      </w:r>
+      <w:r>
+        <w:rPr>
+          <w:b/>
+          <w:bCs/>
+          <w:noProof/>
+          <w:sz w:val="28"/>
+          <w:szCs w:val="28"/>
+          <w:cs/>
+        </w:rPr>
         <w:t xml:space="preserve">หน้าที่ของ </w:t>
       </w:r>
       <w:r>
@@ -8475,7 +9022,27 @@
           <w:sz w:val="28"/>
           <w:szCs w:val="28"/>
         </w:rPr>
-        <w:t xml:space="preserve">2.1.8 </w:t>
+        <w:t>2.1.</w:t>
+      </w:r>
+      <w:r>
+        <w:rPr>
+          <w:b/>
+          <w:bCs/>
+          <w:noProof/>
+          <w:sz w:val="28"/>
+          <w:szCs w:val="28"/>
+        </w:rPr>
+        <w:t>9</w:t>
+      </w:r>
+      <w:r>
+        <w:rPr>
+          <w:b/>
+          <w:bCs/>
+          <w:noProof/>
+          <w:sz w:val="28"/>
+          <w:szCs w:val="28"/>
+        </w:rPr>
+        <w:t xml:space="preserve"> </w:t>
       </w:r>
       <w:r>
         <w:rPr>
@@ -8699,7 +9266,6 @@
           <w:p>
             <w:pPr>
               <w:rPr>
-                <w:rFonts w:hint="cs"/>
                 <w:noProof/>
                 <w:szCs w:val="24"/>
               </w:rPr>
@@ -8721,7 +9287,6 @@
           <w:p>
             <w:pPr>
               <w:rPr>
-                <w:rFonts w:hint="cs"/>
                 <w:noProof/>
                 <w:szCs w:val="24"/>
                 <w:cs/>
@@ -8732,14 +9297,7 @@
                 <w:noProof/>
                 <w:szCs w:val="24"/>
               </w:rPr>
-              <w:t>Column</w:t>
-            </w:r>
-            <w:r>
-              <w:rPr>
-                <w:noProof/>
-                <w:szCs w:val="24"/>
-              </w:rPr>
-              <w:t xml:space="preserve"> </w:t>
+              <w:t xml:space="preserve">Column </w:t>
             </w:r>
             <w:r>
               <w:rPr>
@@ -8759,7 +9317,6 @@
           <w:p>
             <w:pPr>
               <w:rPr>
-                <w:rFonts w:hint="cs"/>
                 <w:noProof/>
                 <w:szCs w:val="24"/>
               </w:rPr>
@@ -8777,14 +9334,7 @@
                 <w:noProof/>
                 <w:szCs w:val="24"/>
               </w:rPr>
-              <w:t>(</w:t>
-            </w:r>
-            <w:r>
-              <w:rPr>
-                <w:noProof/>
-                <w:szCs w:val="24"/>
-              </w:rPr>
-              <w:t>Condition)</w:t>
+              <w:t>(Condition)</w:t>
             </w:r>
           </w:p>
         </w:tc>
@@ -8797,7 +9347,6 @@
           <w:p>
             <w:pPr>
               <w:rPr>
-                <w:rFonts w:hint="cs"/>
                 <w:noProof/>
                 <w:szCs w:val="24"/>
               </w:rPr>
@@ -8819,7 +9368,6 @@
           <w:p>
             <w:pPr>
               <w:rPr>
-                <w:rFonts w:hint="cs"/>
                 <w:noProof/>
                 <w:szCs w:val="24"/>
               </w:rPr>
@@ -8875,21 +9423,12 @@
               </w:rPr>
               <w:t xml:space="preserve"> </w:t>
             </w:r>
-          </w:p>
-          <w:p>
-            <w:pPr>
-              <w:rPr>
-                <w:rFonts w:hint="cs"/>
+            <w:r>
+              <w:rPr>
                 <w:noProof/>
                 <w:szCs w:val="24"/>
               </w:rPr>
-            </w:pPr>
-            <w:r>
-              <w:rPr>
-                <w:noProof/>
-                <w:szCs w:val="24"/>
-              </w:rPr>
-              <w:t>(</w:t>
+              <w:t xml:space="preserve"> </w:t>
             </w:r>
             <w:r>
               <w:rPr>
@@ -8897,22 +9436,7 @@
                 <w:szCs w:val="24"/>
                 <w:cs/>
               </w:rPr>
-              <w:t>งานฉีดพลาสติก</w:t>
-            </w:r>
-            <w:r>
-              <w:rPr>
-                <w:noProof/>
-                <w:szCs w:val="24"/>
-              </w:rPr>
-              <w:t>)</w:t>
-            </w:r>
-            <w:r>
-              <w:rPr>
-                <w:noProof/>
-                <w:szCs w:val="24"/>
-                <w:cs/>
-              </w:rPr>
-              <w:t xml:space="preserve"> เท่านั้น</w:t>
+              <w:t>เท่านั้น</w:t>
             </w:r>
           </w:p>
         </w:tc>
@@ -8925,7 +9449,6 @@
           <w:p>
             <w:pPr>
               <w:rPr>
-                <w:rFonts w:hint="cs"/>
                 <w:noProof/>
                 <w:szCs w:val="24"/>
               </w:rPr>
@@ -8954,7 +9477,6 @@
           <w:p>
             <w:pPr>
               <w:rPr>
-                <w:rFonts w:hint="cs"/>
                 <w:noProof/>
                 <w:szCs w:val="24"/>
               </w:rPr>
@@ -8975,7 +9497,6 @@
           <w:p>
             <w:pPr>
               <w:rPr>
-                <w:rFonts w:hint="cs"/>
                 <w:noProof/>
                 <w:szCs w:val="24"/>
               </w:rPr>
@@ -9038,7 +9559,6 @@
           <w:p>
             <w:pPr>
               <w:rPr>
-                <w:rFonts w:hint="cs"/>
                 <w:noProof/>
                 <w:szCs w:val="24"/>
               </w:rPr>
@@ -9061,7 +9581,6 @@
           <w:p>
             <w:pPr>
               <w:rPr>
-                <w:rFonts w:hint="cs"/>
                 <w:noProof/>
                 <w:szCs w:val="24"/>
               </w:rPr>
@@ -9082,7 +9601,6 @@
           <w:p>
             <w:pPr>
               <w:rPr>
-                <w:rFonts w:hint="cs"/>
                 <w:noProof/>
                 <w:szCs w:val="24"/>
               </w:rPr>
@@ -9130,7 +9648,6 @@
           <w:p>
             <w:pPr>
               <w:rPr>
-                <w:rFonts w:hint="cs"/>
                 <w:noProof/>
                 <w:szCs w:val="24"/>
               </w:rPr>
@@ -9148,14 +9665,7 @@
                 <w:noProof/>
                 <w:szCs w:val="24"/>
               </w:rPr>
-              <w:t>(</w:t>
-            </w:r>
-            <w:r>
-              <w:rPr>
-                <w:noProof/>
-                <w:szCs w:val="24"/>
-              </w:rPr>
-              <w:t>Dynamic)</w:t>
+              <w:t>(Dynamic)</w:t>
             </w:r>
           </w:p>
         </w:tc>
@@ -9166,7 +9676,6 @@
           <w:p>
             <w:pPr>
               <w:rPr>
-                <w:rFonts w:hint="cs"/>
                 <w:noProof/>
                 <w:szCs w:val="24"/>
               </w:rPr>
@@ -9187,7 +9696,6 @@
           <w:p>
             <w:pPr>
               <w:rPr>
-                <w:rFonts w:hint="cs"/>
                 <w:noProof/>
                 <w:szCs w:val="24"/>
               </w:rPr>
@@ -9247,69 +9755,6 @@
     <w:p>
       <w:pPr>
         <w:rPr>
-          <w:noProof/>
-          <w:sz w:val="28"/>
-          <w:szCs w:val="28"/>
-        </w:rPr>
-      </w:pPr>
-    </w:p>
-    <w:p>
-      <w:pPr>
-        <w:rPr>
-          <w:noProof/>
-          <w:sz w:val="28"/>
-          <w:szCs w:val="28"/>
-        </w:rPr>
-      </w:pPr>
-    </w:p>
-    <w:p>
-      <w:pPr>
-        <w:rPr>
-          <w:noProof/>
-          <w:sz w:val="28"/>
-          <w:szCs w:val="28"/>
-        </w:rPr>
-      </w:pPr>
-    </w:p>
-    <w:p>
-      <w:pPr>
-        <w:rPr>
-          <w:noProof/>
-          <w:sz w:val="28"/>
-          <w:szCs w:val="28"/>
-        </w:rPr>
-      </w:pPr>
-    </w:p>
-    <w:p>
-      <w:pPr>
-        <w:rPr>
-          <w:noProof/>
-          <w:sz w:val="28"/>
-          <w:szCs w:val="28"/>
-        </w:rPr>
-      </w:pPr>
-    </w:p>
-    <w:p>
-      <w:pPr>
-        <w:rPr>
-          <w:noProof/>
-          <w:sz w:val="28"/>
-          <w:szCs w:val="28"/>
-        </w:rPr>
-      </w:pPr>
-    </w:p>
-    <w:p>
-      <w:pPr>
-        <w:rPr>
-          <w:noProof/>
-          <w:sz w:val="28"/>
-          <w:szCs w:val="28"/>
-        </w:rPr>
-      </w:pPr>
-    </w:p>
-    <w:p>
-      <w:pPr>
-        <w:rPr>
           <w:rFonts w:hint="cs"/>
           <w:noProof/>
           <w:sz w:val="28"/>
@@ -9385,7 +9830,15 @@
           <w:szCs w:val="28"/>
           <w:cs/>
         </w:rPr>
-        <w:t>เนื่องจากการบันทึกข้อมูลอาจมีการส่งข้อมูลซ้ำจากระบบ ระบบจึงต้องทำความสะอาดข้อมูล (</w:t>
+        <w:t xml:space="preserve">เนื่องจากการบันทึกข้อมูลอาจมีการส่งข้อมูลซ้ำจากระบบ ระบบจึงต้องทำความสะอาดข้อมูล </w:t>
+      </w:r>
+      <w:r>
+        <w:rPr>
+          <w:noProof/>
+          <w:sz w:val="28"/>
+          <w:szCs w:val="28"/>
+        </w:rPr>
+        <w:t>(</w:t>
       </w:r>
       <w:r>
         <w:rPr>
@@ -9402,7 +9855,60 @@
           <w:szCs w:val="28"/>
           <w:cs/>
         </w:rPr>
-        <w:t xml:space="preserve">เพื่อไม่ให้เกิดการนับชิ้นงานเสียเบิ้ล </w:t>
+        <w:t>เพื่อไม่ให้เกิดการนับชิ้นงานเสีย</w:t>
+      </w:r>
+      <w:r>
+        <w:rPr>
+          <w:noProof/>
+          <w:sz w:val="28"/>
+          <w:szCs w:val="28"/>
+        </w:rPr>
+        <w:t xml:space="preserve"> </w:t>
+      </w:r>
+      <w:r>
+        <w:rPr>
+          <w:rFonts w:hint="cs"/>
+          <w:noProof/>
+          <w:sz w:val="28"/>
+          <w:szCs w:val="28"/>
+          <w:cs/>
+        </w:rPr>
+        <w:t xml:space="preserve">เพื่อไม่ให้ข้อมูลเกิดการซับซ้อนในการนับ </w:t>
+      </w:r>
+      <w:r>
+        <w:rPr>
+          <w:noProof/>
+          <w:sz w:val="28"/>
+          <w:szCs w:val="28"/>
+        </w:rPr>
+        <w:t>Lot</w:t>
+      </w:r>
+      <w:r>
+        <w:rPr>
+          <w:noProof/>
+          <w:sz w:val="28"/>
+          <w:szCs w:val="28"/>
+        </w:rPr>
+        <w:t xml:space="preserve"> </w:t>
+      </w:r>
+      <w:r>
+        <w:rPr>
+          <w:rFonts w:hint="cs"/>
+          <w:noProof/>
+          <w:sz w:val="28"/>
+          <w:szCs w:val="28"/>
+          <w:cs/>
+        </w:rPr>
+        <w:t xml:space="preserve"> </w:t>
+      </w:r>
+      <w:r>
+        <w:rPr>
+          <w:noProof/>
+          <w:sz w:val="28"/>
+          <w:szCs w:val="28"/>
+          <w:cs/>
+        </w:rPr>
+        <w:t xml:space="preserve"> </w:t>
       </w:r>
       <w:r>
         <w:rPr>
@@ -11592,14 +12098,6 @@
     </w:p>
     <w:p>
       <w:pPr>
-        <w:rPr>
-          <w:sz w:val="28"/>
-          <w:szCs w:val="28"/>
-        </w:rPr>
-      </w:pPr>
-    </w:p>
-    <w:p>
-      <w:pPr>
         <w:tabs>
           <w:tab w:val="left" w:pos="6739"/>
         </w:tabs>
@@ -11622,6 +12120,18 @@
           <w:tab w:val="left" w:pos="6739"/>
         </w:tabs>
         <w:rPr>
+          <w:sz w:val="28"/>
+          <w:szCs w:val="28"/>
+        </w:rPr>
+      </w:pPr>
+    </w:p>
+    <w:p>
+      <w:pPr>
+        <w:tabs>
+          <w:tab w:val="left" w:pos="6739"/>
+        </w:tabs>
+        <w:rPr>
+          <w:rFonts w:hint="cs"/>
           <w:b/>
           <w:bCs/>
           <w:sz w:val="28"/>
@@ -11646,25 +12156,16 @@
           <w:szCs w:val="28"/>
           <w:cs/>
         </w:rPr>
-        <w:t xml:space="preserve">การนับยอดแยกระดับเบ้าหลอม </w:t>
-      </w:r>
-      <w:r>
-        <w:rPr>
-          <w:b/>
-          <w:bCs/>
-          <w:sz w:val="28"/>
-          <w:szCs w:val="28"/>
-        </w:rPr>
-        <w:t>(</w:t>
-      </w:r>
-      <w:r>
-        <w:rPr>
-          <w:b/>
-          <w:bCs/>
-          <w:sz w:val="28"/>
-          <w:szCs w:val="28"/>
-        </w:rPr>
-        <w:t>Cavity Breakdown Aggregation)</w:t>
+        <w:t xml:space="preserve"> </w:t>
+      </w:r>
+      <w:r>
+        <w:rPr>
+          <w:b/>
+          <w:bCs/>
+          <w:sz w:val="28"/>
+          <w:szCs w:val="28"/>
+        </w:rPr>
+        <w:t>Cavity Breakdown Aggregation</w:t>
       </w:r>
     </w:p>
     <w:p>
@@ -14572,7 +15073,6 @@
           <w:tab w:val="left" w:pos="3867"/>
         </w:tabs>
         <w:rPr>
-          <w:rFonts w:hint="cs"/>
           <w:sz w:val="28"/>
           <w:szCs w:val="28"/>
         </w:rPr>
@@ -14617,16 +15117,7 @@
           <w:sz w:val="28"/>
           <w:szCs w:val="28"/>
         </w:rPr>
-        <w:t>(</w:t>
-      </w:r>
-      <w:r>
-        <w:rPr>
-          <w:b/>
-          <w:bCs/>
-          <w:sz w:val="28"/>
-          <w:szCs w:val="28"/>
-        </w:rPr>
-        <w:t>Sorting)</w:t>
+        <w:t>(Sorting)</w:t>
       </w:r>
     </w:p>
     <w:p>
@@ -14652,14 +15143,7 @@
           <w:sz w:val="28"/>
           <w:szCs w:val="28"/>
         </w:rPr>
-        <w:t>(</w:t>
-      </w:r>
-      <w:r>
-        <w:rPr>
-          <w:sz w:val="28"/>
-          <w:szCs w:val="28"/>
-        </w:rPr>
-        <w:t xml:space="preserve">ORDER BY) </w:t>
+        <w:t xml:space="preserve">(ORDER BY) </w:t>
       </w:r>
       <w:r>
         <w:rPr>
@@ -14676,7 +15160,6 @@
           <w:tab w:val="left" w:pos="3867"/>
         </w:tabs>
         <w:rPr>
-          <w:rFonts w:hint="cs"/>
           <w:sz w:val="28"/>
           <w:szCs w:val="28"/>
         </w:rPr>
@@ -14709,14 +15192,7 @@
           <w:sz w:val="28"/>
           <w:szCs w:val="28"/>
         </w:rPr>
-        <w:t>(</w:t>
-      </w:r>
-      <w:r>
-        <w:rPr>
-          <w:sz w:val="28"/>
-          <w:szCs w:val="28"/>
-        </w:rPr>
-        <w:t>Sorting Logic)</w:t>
+        <w:t>(Sorting Logic)</w:t>
       </w:r>
     </w:p>
     <w:tbl>
@@ -14875,7 +15351,6 @@
                 <w:tab w:val="left" w:pos="3867"/>
               </w:tabs>
               <w:rPr>
-                <w:rFonts w:hint="cs"/>
                 <w:szCs w:val="24"/>
               </w:rPr>
             </w:pPr>
@@ -14897,7 +15372,6 @@
                 <w:tab w:val="left" w:pos="3867"/>
               </w:tabs>
               <w:rPr>
-                <w:rFonts w:hint="cs"/>
                 <w:szCs w:val="24"/>
                 <w:cs/>
               </w:rPr>
@@ -15068,7 +15542,6 @@
                 <w:tab w:val="left" w:pos="3867"/>
               </w:tabs>
               <w:rPr>
-                <w:rFonts w:hint="cs"/>
                 <w:szCs w:val="24"/>
               </w:rPr>
             </w:pPr>
@@ -15295,16 +15768,25 @@
           <w:szCs w:val="28"/>
         </w:rPr>
         <w:lastRenderedPageBreak/>
-        <w:t>1.1.</w:t>
-      </w:r>
-      <w:r>
-        <w:rPr>
-          <w:b/>
-          <w:bCs/>
-          <w:sz w:val="28"/>
-          <w:szCs w:val="28"/>
-        </w:rPr>
-        <w:t>8</w:t>
+        <w:t>2</w:t>
+      </w:r>
+      <w:r>
+        <w:rPr>
+          <w:b/>
+          <w:bCs/>
+          <w:sz w:val="28"/>
+          <w:szCs w:val="28"/>
+        </w:rPr>
+        <w:t>.1.</w:t>
+      </w:r>
+      <w:r>
+        <w:rPr>
+          <w:b/>
+          <w:bCs/>
+          <w:sz w:val="28"/>
+          <w:szCs w:val="28"/>
+        </w:rPr>
+        <w:t>10</w:t>
       </w:r>
       <w:r>
         <w:rPr>
@@ -15682,7 +16164,6 @@
         </w:rPr>
         <w:t xml:space="preserve">▼ </w:t>
       </w:r>
-      <w:proofErr w:type="gramStart"/>
       <w:r>
         <w:rPr>
           <w:rFonts w:ascii="Segoe UI Emoji" w:hAnsi="Segoe UI Emoji" w:cs="Segoe UI Emoji"/>
@@ -15695,181 +16176,130 @@
           <w:rFonts w:cs="Arial"/>
           <w:szCs w:val="24"/>
         </w:rPr>
-        <w:t xml:space="preserve">  D</w:t>
-      </w:r>
-      <w:proofErr w:type="gramEnd"/>
+        <w:t xml:space="preserve">  D1 — QC Overview /</w:t>
+      </w:r>
+    </w:p>
+    <w:p>
+      <w:pPr>
+        <w:rPr>
+          <w:rFonts w:cs="Segoe UI Emoji"/>
+          <w:szCs w:val="24"/>
+        </w:rPr>
+      </w:pPr>
       <w:r>
         <w:rPr>
           <w:rFonts w:cs="Arial"/>
           <w:szCs w:val="24"/>
         </w:rPr>
-        <w:t>1 — QC Overview /</w:t>
-      </w:r>
-    </w:p>
-    <w:p>
-      <w:pPr>
+        <w:t xml:space="preserve">  &gt;  </w:t>
+      </w:r>
+      <w:r>
+        <w:rPr>
+          <w:rFonts w:ascii="Segoe UI Emoji" w:hAnsi="Segoe UI Emoji" w:cs="Segoe UI Emoji"/>
+          <w:szCs w:val="24"/>
+        </w:rPr>
+        <w:t>🖥️</w:t>
+      </w:r>
+      <w:r>
         <w:rPr>
           <w:rFonts w:cs="Segoe UI Emoji"/>
           <w:szCs w:val="24"/>
         </w:rPr>
-      </w:pPr>
-      <w:r>
-        <w:rPr>
-          <w:rFonts w:cs="Arial"/>
+        <w:t xml:space="preserve">  QC_MEMBER WORKLOAD /</w:t>
+      </w:r>
+    </w:p>
+    <w:p>
+      <w:pPr>
+        <w:rPr>
+          <w:rFonts w:cs="Segoe UI Emoji"/>
+          <w:szCs w:val="24"/>
+        </w:rPr>
+      </w:pPr>
+      <w:r>
+        <w:rPr>
+          <w:rFonts w:cs="Segoe UI Emoji"/>
+          <w:szCs w:val="24"/>
+        </w:rPr>
+        <w:t xml:space="preserve">          -&gt; </w:t>
+      </w:r>
+      <w:r>
+        <w:rPr>
+          <w:rFonts w:ascii="Segoe UI Emoji" w:hAnsi="Segoe UI Emoji" w:cs="Segoe UI Emoji"/>
+          <w:szCs w:val="24"/>
+        </w:rPr>
+        <w:t>📊</w:t>
+      </w:r>
+      <w:r>
+        <w:rPr>
+          <w:rFonts w:cs="Segoe UI Emoji"/>
           <w:szCs w:val="24"/>
         </w:rPr>
         <w:t xml:space="preserve">  </w:t>
       </w:r>
-      <w:proofErr w:type="gramStart"/>
-      <w:r>
-        <w:rPr>
-          <w:rFonts w:cs="Arial"/>
-          <w:szCs w:val="24"/>
-        </w:rPr>
-        <w:t xml:space="preserve">&gt;  </w:t>
+      <w:r>
+        <w:rPr>
+          <w:rFonts w:cs="Segoe UI Emoji"/>
+          <w:szCs w:val="24"/>
+        </w:rPr>
+        <w:t>QR_MEMBER WORKLOAD BY LOT</w:t>
+      </w:r>
+    </w:p>
+    <w:p>
+      <w:pPr>
+        <w:rPr>
+          <w:rFonts w:cs="Segoe UI Emoji"/>
+          <w:szCs w:val="24"/>
+        </w:rPr>
+      </w:pPr>
+      <w:r>
+        <w:rPr>
+          <w:rFonts w:cs="Segoe UI Emoji"/>
+          <w:szCs w:val="24"/>
+        </w:rPr>
+        <w:t xml:space="preserve">          -&gt; </w:t>
       </w:r>
       <w:r>
         <w:rPr>
           <w:rFonts w:ascii="Segoe UI Emoji" w:hAnsi="Segoe UI Emoji" w:cs="Segoe UI Emoji"/>
           <w:szCs w:val="24"/>
         </w:rPr>
-        <w:t>🖥️</w:t>
+        <w:t>📊</w:t>
       </w:r>
       <w:r>
         <w:rPr>
           <w:rFonts w:cs="Segoe UI Emoji"/>
           <w:szCs w:val="24"/>
         </w:rPr>
-        <w:t xml:space="preserve">  QC</w:t>
-      </w:r>
-      <w:proofErr w:type="gramEnd"/>
-      <w:r>
+        <w:t xml:space="preserve">  QR_MEMBER WORKLOAD BY STATE TIMELINE</w:t>
+      </w:r>
+    </w:p>
+    <w:p>
+      <w:pPr>
         <w:rPr>
           <w:rFonts w:cs="Segoe UI Emoji"/>
           <w:szCs w:val="24"/>
         </w:rPr>
-        <w:t>_MEMBER WORKLOAD /</w:t>
-      </w:r>
-    </w:p>
-    <w:p>
-      <w:pPr>
+      </w:pPr>
+      <w:r>
         <w:rPr>
           <w:rFonts w:cs="Segoe UI Emoji"/>
           <w:szCs w:val="24"/>
         </w:rPr>
-      </w:pPr>
+        <w:t xml:space="preserve">          -&gt; </w:t>
+      </w:r>
+      <w:r>
+        <w:rPr>
+          <w:rFonts w:ascii="Segoe UI Emoji" w:hAnsi="Segoe UI Emoji" w:cs="Segoe UI Emoji"/>
+          <w:szCs w:val="24"/>
+        </w:rPr>
+        <w:t>📊</w:t>
+      </w:r>
       <w:r>
         <w:rPr>
           <w:rFonts w:cs="Segoe UI Emoji"/>
           <w:szCs w:val="24"/>
         </w:rPr>
-        <w:t xml:space="preserve">          -&gt; </w:t>
-      </w:r>
-      <w:proofErr w:type="gramStart"/>
-      <w:r>
-        <w:rPr>
-          <w:rFonts w:ascii="Segoe UI Emoji" w:hAnsi="Segoe UI Emoji" w:cs="Segoe UI Emoji"/>
-          <w:szCs w:val="24"/>
-        </w:rPr>
-        <w:t>📊</w:t>
-      </w:r>
-      <w:r>
-        <w:rPr>
-          <w:rFonts w:cs="Segoe UI Emoji"/>
-          <w:szCs w:val="24"/>
-        </w:rPr>
-        <w:t xml:space="preserve">  </w:t>
-      </w:r>
-      <w:r>
-        <w:rPr>
-          <w:rFonts w:cs="Segoe UI Emoji"/>
-          <w:szCs w:val="24"/>
-        </w:rPr>
-        <w:t>QR</w:t>
-      </w:r>
-      <w:proofErr w:type="gramEnd"/>
-      <w:r>
-        <w:rPr>
-          <w:rFonts w:cs="Segoe UI Emoji"/>
-          <w:szCs w:val="24"/>
-        </w:rPr>
-        <w:t>_MEMBER WORKLOAD BY LOT</w:t>
-      </w:r>
-    </w:p>
-    <w:p>
-      <w:pPr>
-        <w:rPr>
-          <w:rFonts w:cs="Segoe UI Emoji"/>
-          <w:szCs w:val="24"/>
-        </w:rPr>
-      </w:pPr>
-      <w:r>
-        <w:rPr>
-          <w:rFonts w:cs="Segoe UI Emoji"/>
-          <w:szCs w:val="24"/>
-        </w:rPr>
-        <w:t xml:space="preserve">          -&gt; </w:t>
-      </w:r>
-      <w:proofErr w:type="gramStart"/>
-      <w:r>
-        <w:rPr>
-          <w:rFonts w:ascii="Segoe UI Emoji" w:hAnsi="Segoe UI Emoji" w:cs="Segoe UI Emoji"/>
-          <w:szCs w:val="24"/>
-        </w:rPr>
-        <w:t>📊</w:t>
-      </w:r>
-      <w:r>
-        <w:rPr>
-          <w:rFonts w:cs="Segoe UI Emoji"/>
-          <w:szCs w:val="24"/>
-        </w:rPr>
-        <w:t xml:space="preserve">  QR</w:t>
-      </w:r>
-      <w:proofErr w:type="gramEnd"/>
-      <w:r>
-        <w:rPr>
-          <w:rFonts w:cs="Segoe UI Emoji"/>
-          <w:szCs w:val="24"/>
-        </w:rPr>
-        <w:t>_MEMBER WORKLOAD BY STATE TIMELINE</w:t>
-      </w:r>
-    </w:p>
-    <w:p>
-      <w:pPr>
-        <w:rPr>
-          <w:rFonts w:cs="Segoe UI Emoji"/>
-          <w:szCs w:val="24"/>
-        </w:rPr>
-      </w:pPr>
-      <w:r>
-        <w:rPr>
-          <w:rFonts w:cs="Segoe UI Emoji"/>
-          <w:szCs w:val="24"/>
-        </w:rPr>
-        <w:t xml:space="preserve">          -&gt; </w:t>
-      </w:r>
-      <w:proofErr w:type="gramStart"/>
-      <w:r>
-        <w:rPr>
-          <w:rFonts w:ascii="Segoe UI Emoji" w:hAnsi="Segoe UI Emoji" w:cs="Segoe UI Emoji"/>
-          <w:szCs w:val="24"/>
-        </w:rPr>
-        <w:t>📊</w:t>
-      </w:r>
-      <w:r>
-        <w:rPr>
-          <w:rFonts w:cs="Segoe UI Emoji"/>
-          <w:szCs w:val="24"/>
-        </w:rPr>
-        <w:t xml:space="preserve">  QR</w:t>
-      </w:r>
-      <w:proofErr w:type="gramEnd"/>
-      <w:r>
-        <w:rPr>
-          <w:rFonts w:cs="Segoe UI Emoji"/>
-          <w:szCs w:val="24"/>
-        </w:rPr>
-        <w:t>_MEMBER WORKLOAD BY STATUS</w:t>
+        <w:t xml:space="preserve">  QR_MEMBER WORKLOAD BY STATUS</w:t>
       </w:r>
     </w:p>
     <w:p>
@@ -15934,21 +16364,12 @@
         </w:rPr>
         <w:t xml:space="preserve">          -&gt; </w:t>
       </w:r>
-      <w:proofErr w:type="gramStart"/>
       <w:r>
         <w:rPr>
           <w:rFonts w:ascii="Segoe UI Emoji" w:hAnsi="Segoe UI Emoji" w:cs="Segoe UI Emoji"/>
           <w:szCs w:val="24"/>
         </w:rPr>
-        <w:t>📊  ROOM</w:t>
-      </w:r>
-      <w:proofErr w:type="gramEnd"/>
-      <w:r>
-        <w:rPr>
-          <w:rFonts w:ascii="Segoe UI Emoji" w:hAnsi="Segoe UI Emoji" w:cs="Segoe UI Emoji"/>
-          <w:szCs w:val="24"/>
-        </w:rPr>
-        <w:t xml:space="preserve"> TEMP &amp; HUMIDITY PER MONTHLY AVG</w:t>
+        <w:t>📊  ROOM TEMP &amp; HUMIDITY PER MONTHLY AVG</w:t>
       </w:r>
     </w:p>
     <w:p>
@@ -16040,7 +16461,6 @@
           </mc:Fallback>
         </mc:AlternateContent>
       </w:r>
-      <w:proofErr w:type="gramStart"/>
       <w:r>
         <w:rPr>
           <w:rFonts w:ascii="Arial" w:hAnsi="Arial" w:cs="Arial"/>
@@ -16062,7 +16482,6 @@
         </w:rPr>
         <w:t>📂</w:t>
       </w:r>
-      <w:proofErr w:type="gramEnd"/>
       <w:r>
         <w:rPr>
           <w:rFonts w:cs="Arial"/>
@@ -16083,9 +16502,72 @@
           <w:rFonts w:cs="Arial"/>
           <w:szCs w:val="24"/>
         </w:rPr>
+        <w:t xml:space="preserve">  &gt;  </w:t>
+      </w:r>
+      <w:r>
+        <w:rPr>
+          <w:rFonts w:ascii="Segoe UI Emoji" w:hAnsi="Segoe UI Emoji" w:cs="Segoe UI Emoji"/>
+          <w:szCs w:val="24"/>
+        </w:rPr>
+        <w:t>🖥️</w:t>
+      </w:r>
+      <w:r>
+        <w:rPr>
+          <w:rFonts w:cs="Segoe UI Emoji"/>
+          <w:szCs w:val="24"/>
+        </w:rPr>
+        <w:t xml:space="preserve">   JUDGEMENT BY ISC CODE /</w:t>
+      </w:r>
+    </w:p>
+    <w:p>
+      <w:pPr>
+        <w:rPr>
+          <w:rFonts w:cs="Segoe UI Emoji"/>
+          <w:b/>
+          <w:bCs/>
+          <w:color w:val="FF0000"/>
+          <w:szCs w:val="24"/>
+        </w:rPr>
+      </w:pPr>
+      <w:r>
+        <w:rPr>
+          <w:rFonts w:cs="Segoe UI Emoji"/>
+          <w:szCs w:val="24"/>
+        </w:rPr>
+        <w:t xml:space="preserve">           &gt; </w:t>
+      </w:r>
+      <w:r>
+        <w:rPr>
+          <w:rFonts w:ascii="Segoe UI Emoji" w:hAnsi="Segoe UI Emoji" w:cs="Segoe UI Emoji"/>
+          <w:szCs w:val="24"/>
+        </w:rPr>
+        <w:t>📊</w:t>
+      </w:r>
+      <w:r>
+        <w:rPr>
+          <w:rFonts w:cs="Segoe UI Emoji"/>
+          <w:szCs w:val="24"/>
+        </w:rPr>
         <w:t xml:space="preserve">  </w:t>
       </w:r>
-      <w:proofErr w:type="gramStart"/>
+      <w:r>
+        <w:rPr>
+          <w:rFonts w:cs="Segoe UI Emoji"/>
+          <w:b/>
+          <w:bCs/>
+          <w:color w:val="FF0000"/>
+          <w:szCs w:val="24"/>
+        </w:rPr>
+        <w:t>JUDGEMENT BY ISC CODE</w:t>
+      </w:r>
+    </w:p>
+    <w:p>
+      <w:pPr>
+        <w:rPr>
+          <w:rFonts w:cs="Segoe UI Emoji"/>
+          <w:szCs w:val="24"/>
+        </w:rPr>
+      </w:pPr>
       <w:r>
         <w:rPr>
           <w:rFonts w:cs="Arial"/>
@@ -16098,42 +16580,88 @@
           <w:rFonts w:ascii="Segoe UI Emoji" w:hAnsi="Segoe UI Emoji" w:cs="Segoe UI Emoji"/>
           <w:szCs w:val="24"/>
         </w:rPr>
-        <w:t>🖥</w:t>
-      </w:r>
-      <w:proofErr w:type="gramEnd"/>
+        <w:t>🖥️</w:t>
+      </w:r>
+      <w:r>
+        <w:rPr>
+          <w:rFonts w:cs="Segoe UI Emoji"/>
+          <w:szCs w:val="24"/>
+        </w:rPr>
+        <w:t xml:space="preserve">   NG BY ISC CODE /</w:t>
+      </w:r>
+    </w:p>
+    <w:p>
+      <w:pPr>
+        <w:rPr>
+          <w:rFonts w:cs="Segoe UI Emoji"/>
+          <w:szCs w:val="24"/>
+        </w:rPr>
+      </w:pPr>
+      <w:r>
+        <w:rPr>
+          <w:rFonts w:cs="Segoe UI Emoji"/>
+          <w:szCs w:val="24"/>
+        </w:rPr>
+        <w:t xml:space="preserve">           &gt; </w:t>
+      </w:r>
       <w:r>
         <w:rPr>
           <w:rFonts w:ascii="Segoe UI Emoji" w:hAnsi="Segoe UI Emoji" w:cs="Segoe UI Emoji"/>
           <w:szCs w:val="24"/>
         </w:rPr>
-        <w:t>️</w:t>
+        <w:t>📊</w:t>
       </w:r>
       <w:r>
         <w:rPr>
           <w:rFonts w:cs="Segoe UI Emoji"/>
           <w:szCs w:val="24"/>
         </w:rPr>
-        <w:t xml:space="preserve">   JUDGEMENT BY ISC CODE /</w:t>
+        <w:t xml:space="preserve">  NG BY ISC CODE</w:t>
       </w:r>
     </w:p>
     <w:p>
       <w:pPr>
         <w:rPr>
           <w:rFonts w:cs="Segoe UI Emoji"/>
-          <w:b/>
-          <w:bCs/>
-          <w:color w:val="FF0000"/>
-          <w:szCs w:val="24"/>
-        </w:rPr>
-      </w:pPr>
+          <w:szCs w:val="24"/>
+        </w:rPr>
+      </w:pPr>
+      <w:r>
+        <w:rPr>
+          <w:rFonts w:cs="Arial"/>
+          <w:szCs w:val="24"/>
+        </w:rPr>
+        <w:t xml:space="preserve">&gt;  </w:t>
+      </w:r>
+      <w:r>
+        <w:rPr>
+          <w:rFonts w:ascii="Segoe UI Emoji" w:hAnsi="Segoe UI Emoji" w:cs="Segoe UI Emoji"/>
+          <w:szCs w:val="24"/>
+        </w:rPr>
+        <w:t>🖥️</w:t>
+      </w:r>
       <w:r>
         <w:rPr>
           <w:rFonts w:cs="Segoe UI Emoji"/>
           <w:szCs w:val="24"/>
         </w:rPr>
+        <w:t xml:space="preserve">   X̄ CONTROL CHART PER SEQUENCE/DATE (X̄ CHART) /</w:t>
+      </w:r>
+    </w:p>
+    <w:p>
+      <w:pPr>
+        <w:rPr>
+          <w:rFonts w:cs="Segoe UI Emoji"/>
+          <w:szCs w:val="24"/>
+        </w:rPr>
+      </w:pPr>
+      <w:r>
+        <w:rPr>
+          <w:rFonts w:cs="Segoe UI Emoji"/>
+          <w:szCs w:val="24"/>
+        </w:rPr>
         <w:t xml:space="preserve">           &gt; </w:t>
       </w:r>
-      <w:proofErr w:type="gramStart"/>
       <w:r>
         <w:rPr>
           <w:rFonts w:ascii="Segoe UI Emoji" w:hAnsi="Segoe UI Emoji" w:cs="Segoe UI Emoji"/>
@@ -16146,180 +16674,7 @@
           <w:rFonts w:cs="Segoe UI Emoji"/>
           <w:szCs w:val="24"/>
         </w:rPr>
-        <w:t xml:space="preserve">  </w:t>
-      </w:r>
-      <w:r>
-        <w:rPr>
-          <w:rFonts w:cs="Segoe UI Emoji"/>
-          <w:b/>
-          <w:bCs/>
-          <w:color w:val="FF0000"/>
-          <w:szCs w:val="24"/>
-        </w:rPr>
-        <w:t>JUDGEMENT</w:t>
-      </w:r>
-      <w:proofErr w:type="gramEnd"/>
-      <w:r>
-        <w:rPr>
-          <w:rFonts w:cs="Segoe UI Emoji"/>
-          <w:b/>
-          <w:bCs/>
-          <w:color w:val="FF0000"/>
-          <w:szCs w:val="24"/>
-        </w:rPr>
-        <w:t xml:space="preserve"> BY ISC CODE</w:t>
-      </w:r>
-    </w:p>
-    <w:p>
-      <w:pPr>
-        <w:rPr>
-          <w:rFonts w:cs="Segoe UI Emoji"/>
-          <w:szCs w:val="24"/>
-        </w:rPr>
-      </w:pPr>
-      <w:proofErr w:type="gramStart"/>
-      <w:r>
-        <w:rPr>
-          <w:rFonts w:cs="Arial"/>
-          <w:szCs w:val="24"/>
-        </w:rPr>
-        <w:t xml:space="preserve">&gt;  </w:t>
-      </w:r>
-      <w:r>
-        <w:rPr>
-          <w:rFonts w:ascii="Segoe UI Emoji" w:hAnsi="Segoe UI Emoji" w:cs="Segoe UI Emoji"/>
-          <w:szCs w:val="24"/>
-        </w:rPr>
-        <w:t>🖥</w:t>
-      </w:r>
-      <w:proofErr w:type="gramEnd"/>
-      <w:r>
-        <w:rPr>
-          <w:rFonts w:ascii="Segoe UI Emoji" w:hAnsi="Segoe UI Emoji" w:cs="Segoe UI Emoji"/>
-          <w:szCs w:val="24"/>
-        </w:rPr>
-        <w:t>️</w:t>
-      </w:r>
-      <w:r>
-        <w:rPr>
-          <w:rFonts w:cs="Segoe UI Emoji"/>
-          <w:szCs w:val="24"/>
-        </w:rPr>
-        <w:t xml:space="preserve">   NG BY ISC CODE /</w:t>
-      </w:r>
-    </w:p>
-    <w:p>
-      <w:pPr>
-        <w:rPr>
-          <w:rFonts w:cs="Segoe UI Emoji"/>
-          <w:szCs w:val="24"/>
-        </w:rPr>
-      </w:pPr>
-      <w:r>
-        <w:rPr>
-          <w:rFonts w:cs="Segoe UI Emoji"/>
-          <w:szCs w:val="24"/>
-        </w:rPr>
-        <w:t xml:space="preserve">           &gt; </w:t>
-      </w:r>
-      <w:proofErr w:type="gramStart"/>
-      <w:r>
-        <w:rPr>
-          <w:rFonts w:ascii="Segoe UI Emoji" w:hAnsi="Segoe UI Emoji" w:cs="Segoe UI Emoji"/>
-          <w:szCs w:val="24"/>
-        </w:rPr>
-        <w:t>📊</w:t>
-      </w:r>
-      <w:r>
-        <w:rPr>
-          <w:rFonts w:cs="Segoe UI Emoji"/>
-          <w:szCs w:val="24"/>
-        </w:rPr>
-        <w:t xml:space="preserve">  NG</w:t>
-      </w:r>
-      <w:proofErr w:type="gramEnd"/>
-      <w:r>
-        <w:rPr>
-          <w:rFonts w:cs="Segoe UI Emoji"/>
-          <w:szCs w:val="24"/>
-        </w:rPr>
-        <w:t xml:space="preserve"> BY ISC CODE</w:t>
-      </w:r>
-    </w:p>
-    <w:p>
-      <w:pPr>
-        <w:rPr>
-          <w:rFonts w:cs="Segoe UI Emoji"/>
-          <w:szCs w:val="24"/>
-        </w:rPr>
-      </w:pPr>
-      <w:proofErr w:type="gramStart"/>
-      <w:r>
-        <w:rPr>
-          <w:rFonts w:cs="Arial"/>
-          <w:szCs w:val="24"/>
-        </w:rPr>
-        <w:t xml:space="preserve">&gt;  </w:t>
-      </w:r>
-      <w:r>
-        <w:rPr>
-          <w:rFonts w:ascii="Segoe UI Emoji" w:hAnsi="Segoe UI Emoji" w:cs="Segoe UI Emoji"/>
-          <w:szCs w:val="24"/>
-        </w:rPr>
-        <w:t>🖥</w:t>
-      </w:r>
-      <w:proofErr w:type="gramEnd"/>
-      <w:r>
-        <w:rPr>
-          <w:rFonts w:ascii="Segoe UI Emoji" w:hAnsi="Segoe UI Emoji" w:cs="Segoe UI Emoji"/>
-          <w:szCs w:val="24"/>
-        </w:rPr>
-        <w:t>️</w:t>
-      </w:r>
-      <w:r>
-        <w:rPr>
-          <w:rFonts w:cs="Segoe UI Emoji"/>
-          <w:szCs w:val="24"/>
-        </w:rPr>
-        <w:t xml:space="preserve">   X̄ CONTROL CHART PER SEQUENCE/DATE (X̄ CHART) /</w:t>
-      </w:r>
-    </w:p>
-    <w:p>
-      <w:pPr>
-        <w:rPr>
-          <w:rFonts w:cs="Segoe UI Emoji"/>
-          <w:szCs w:val="24"/>
-        </w:rPr>
-      </w:pPr>
-      <w:r>
-        <w:rPr>
-          <w:rFonts w:cs="Segoe UI Emoji"/>
-          <w:szCs w:val="24"/>
-        </w:rPr>
-        <w:t xml:space="preserve">           &gt; </w:t>
-      </w:r>
-      <w:proofErr w:type="gramStart"/>
-      <w:r>
-        <w:rPr>
-          <w:rFonts w:ascii="Segoe UI Emoji" w:hAnsi="Segoe UI Emoji" w:cs="Segoe UI Emoji"/>
-          <w:szCs w:val="24"/>
-        </w:rPr>
-        <w:t>📊</w:t>
-      </w:r>
-      <w:r>
-        <w:rPr>
-          <w:rFonts w:cs="Segoe UI Emoji"/>
-          <w:szCs w:val="24"/>
-        </w:rPr>
-        <w:t xml:space="preserve">  X̄</w:t>
-      </w:r>
-      <w:proofErr w:type="gramEnd"/>
-      <w:r>
-        <w:rPr>
-          <w:rFonts w:cs="Segoe UI Emoji"/>
-          <w:szCs w:val="24"/>
-        </w:rPr>
-        <w:t xml:space="preserve"> CONTROL CHART PER SEQUENCE/DATE (X̄ CHART)</w:t>
+        <w:t xml:space="preserve">  X̄ CONTROL CHART PER SEQUENCE/DATE (X̄ CHART)</w:t>
       </w:r>
     </w:p>
     <w:p>
@@ -16570,234 +16925,173 @@
           <w:rFonts w:cs="Arial"/>
           <w:szCs w:val="24"/>
         </w:rPr>
+        <w:t xml:space="preserve">  &gt;  </w:t>
+      </w:r>
+      <w:r>
+        <w:rPr>
+          <w:rFonts w:ascii="Segoe UI Emoji" w:hAnsi="Segoe UI Emoji" w:cs="Segoe UI Emoji"/>
+          <w:szCs w:val="24"/>
+        </w:rPr>
+        <w:t>🖥️</w:t>
+      </w:r>
+      <w:r>
+        <w:rPr>
+          <w:rFonts w:cs="Segoe UI Emoji"/>
+          <w:szCs w:val="24"/>
+        </w:rPr>
+        <w:t xml:space="preserve">   CAVITY — INSPECTION COUNT (NG) PER CAVITY /</w:t>
+      </w:r>
+    </w:p>
+    <w:p>
+      <w:pPr>
+        <w:rPr>
+          <w:rFonts w:cs="Segoe UI Emoji"/>
+          <w:szCs w:val="24"/>
+        </w:rPr>
+      </w:pPr>
+      <w:r>
+        <w:rPr>
+          <w:rFonts w:cs="Segoe UI Emoji"/>
+          <w:szCs w:val="24"/>
+        </w:rPr>
+        <w:t xml:space="preserve">           &gt; </w:t>
+      </w:r>
+      <w:r>
+        <w:rPr>
+          <w:rFonts w:ascii="Segoe UI Emoji" w:hAnsi="Segoe UI Emoji" w:cs="Segoe UI Emoji"/>
+          <w:szCs w:val="24"/>
+        </w:rPr>
+        <w:t>📊</w:t>
+      </w:r>
+      <w:r>
+        <w:rPr>
+          <w:rFonts w:cs="Segoe UI Emoji"/>
+          <w:szCs w:val="24"/>
+        </w:rPr>
+        <w:t xml:space="preserve">  CAVITY — INSPECTION COUNT (NG) PER CAVITY</w:t>
+      </w:r>
+    </w:p>
+    <w:p>
+      <w:pPr>
+        <w:rPr>
+          <w:rFonts w:cs="Segoe UI Emoji"/>
+          <w:szCs w:val="24"/>
+        </w:rPr>
+      </w:pPr>
+      <w:r>
+        <w:rPr>
+          <w:rFonts w:cs="Arial"/>
+          <w:szCs w:val="24"/>
+        </w:rPr>
+        <w:t xml:space="preserve">&gt;  </w:t>
+      </w:r>
+      <w:r>
+        <w:rPr>
+          <w:rFonts w:ascii="Segoe UI Emoji" w:hAnsi="Segoe UI Emoji" w:cs="Segoe UI Emoji"/>
+          <w:szCs w:val="24"/>
+        </w:rPr>
+        <w:t>🖥️</w:t>
+      </w:r>
+      <w:r>
+        <w:rPr>
+          <w:rFonts w:cs="Segoe UI Emoji"/>
+          <w:szCs w:val="24"/>
+        </w:rPr>
+        <w:t xml:space="preserve">   CYCLE TIME — MONTHLY AVG /</w:t>
+      </w:r>
+    </w:p>
+    <w:p>
+      <w:pPr>
+        <w:rPr>
+          <w:rFonts w:cs="Segoe UI Emoji"/>
+          <w:szCs w:val="24"/>
+        </w:rPr>
+      </w:pPr>
+      <w:r>
+        <w:rPr>
+          <w:rFonts w:cs="Segoe UI Emoji"/>
+          <w:szCs w:val="24"/>
+        </w:rPr>
+        <w:t xml:space="preserve">           &gt; </w:t>
+      </w:r>
+      <w:r>
+        <w:rPr>
+          <w:rFonts w:ascii="Segoe UI Emoji" w:hAnsi="Segoe UI Emoji" w:cs="Segoe UI Emoji"/>
+          <w:szCs w:val="24"/>
+        </w:rPr>
+        <w:t>📊</w:t>
+      </w:r>
+      <w:r>
+        <w:rPr>
+          <w:rFonts w:cs="Segoe UI Emoji"/>
+          <w:szCs w:val="24"/>
+        </w:rPr>
+        <w:t xml:space="preserve">  CYCLE TIME — MONTHLY AVG</w:t>
+      </w:r>
+    </w:p>
+    <w:p>
+      <w:pPr>
+        <w:rPr>
+          <w:rFonts w:cs="Segoe UI Emoji"/>
+          <w:szCs w:val="24"/>
+        </w:rPr>
+      </w:pPr>
+      <w:r>
+        <w:rPr>
+          <w:rFonts w:cs="Arial"/>
+          <w:szCs w:val="24"/>
+        </w:rPr>
+        <w:t xml:space="preserve">&gt;  </w:t>
+      </w:r>
+      <w:r>
+        <w:rPr>
+          <w:rFonts w:ascii="Segoe UI Emoji" w:hAnsi="Segoe UI Emoji" w:cs="Segoe UI Emoji"/>
+          <w:szCs w:val="24"/>
+        </w:rPr>
+        <w:t>🖥️</w:t>
+      </w:r>
+      <w:r>
+        <w:rPr>
+          <w:rFonts w:cs="Segoe UI Emoji"/>
+          <w:szCs w:val="24"/>
+        </w:rPr>
+        <w:t xml:space="preserve">   MACHINE NG LOT RATE BY M/C /</w:t>
+      </w:r>
+    </w:p>
+    <w:p>
+      <w:pPr>
+        <w:rPr>
+          <w:rFonts w:cs="Segoe UI Emoji"/>
+          <w:szCs w:val="24"/>
+        </w:rPr>
+      </w:pPr>
+      <w:r>
+        <w:rPr>
+          <w:rFonts w:cs="Segoe UI Emoji"/>
+          <w:szCs w:val="24"/>
+        </w:rPr>
+        <w:t xml:space="preserve">           &gt; </w:t>
+      </w:r>
+      <w:r>
+        <w:rPr>
+          <w:rFonts w:ascii="Segoe UI Emoji" w:hAnsi="Segoe UI Emoji" w:cs="Segoe UI Emoji"/>
+          <w:szCs w:val="24"/>
+        </w:rPr>
+        <w:t>📊</w:t>
+      </w:r>
+      <w:r>
+        <w:rPr>
+          <w:rFonts w:cs="Segoe UI Emoji"/>
+          <w:szCs w:val="24"/>
+        </w:rPr>
         <w:t xml:space="preserve">  </w:t>
       </w:r>
-      <w:proofErr w:type="gramStart"/>
-      <w:r>
-        <w:rPr>
-          <w:rFonts w:cs="Arial"/>
-          <w:szCs w:val="24"/>
-        </w:rPr>
-        <w:t xml:space="preserve">&gt;  </w:t>
-      </w:r>
-      <w:r>
-        <w:rPr>
-          <w:rFonts w:ascii="Segoe UI Emoji" w:hAnsi="Segoe UI Emoji" w:cs="Segoe UI Emoji"/>
-          <w:szCs w:val="24"/>
-        </w:rPr>
-        <w:t>🖥</w:t>
-      </w:r>
-      <w:proofErr w:type="gramEnd"/>
-      <w:r>
-        <w:rPr>
-          <w:rFonts w:ascii="Segoe UI Emoji" w:hAnsi="Segoe UI Emoji" w:cs="Segoe UI Emoji"/>
-          <w:szCs w:val="24"/>
-        </w:rPr>
-        <w:t>️</w:t>
-      </w:r>
       <w:r>
         <w:rPr>
           <w:rFonts w:cs="Segoe UI Emoji"/>
           <w:szCs w:val="24"/>
         </w:rPr>
-        <w:t xml:space="preserve">   CAVITY — INSPECTION COUNT (NG) PER CAVITY /</w:t>
-      </w:r>
-    </w:p>
-    <w:p>
-      <w:pPr>
-        <w:rPr>
-          <w:rFonts w:cs="Segoe UI Emoji"/>
-          <w:szCs w:val="24"/>
-        </w:rPr>
-      </w:pPr>
-      <w:r>
-        <w:rPr>
-          <w:rFonts w:cs="Segoe UI Emoji"/>
-          <w:szCs w:val="24"/>
-        </w:rPr>
-        <w:t xml:space="preserve">           &gt; </w:t>
-      </w:r>
-      <w:proofErr w:type="gramStart"/>
-      <w:r>
-        <w:rPr>
-          <w:rFonts w:ascii="Segoe UI Emoji" w:hAnsi="Segoe UI Emoji" w:cs="Segoe UI Emoji"/>
-          <w:szCs w:val="24"/>
-        </w:rPr>
-        <w:t>📊</w:t>
-      </w:r>
-      <w:r>
-        <w:rPr>
-          <w:rFonts w:cs="Segoe UI Emoji"/>
-          <w:szCs w:val="24"/>
-        </w:rPr>
-        <w:t xml:space="preserve">  CAVITY</w:t>
-      </w:r>
-      <w:proofErr w:type="gramEnd"/>
-      <w:r>
-        <w:rPr>
-          <w:rFonts w:cs="Segoe UI Emoji"/>
-          <w:szCs w:val="24"/>
-        </w:rPr>
-        <w:t xml:space="preserve"> — INSPECTION COUNT (NG) PER CAVITY</w:t>
-      </w:r>
-    </w:p>
-    <w:p>
-      <w:pPr>
-        <w:rPr>
-          <w:rFonts w:cs="Segoe UI Emoji"/>
-          <w:szCs w:val="24"/>
-        </w:rPr>
-      </w:pPr>
-      <w:proofErr w:type="gramStart"/>
-      <w:r>
-        <w:rPr>
-          <w:rFonts w:cs="Arial"/>
-          <w:szCs w:val="24"/>
-        </w:rPr>
-        <w:t xml:space="preserve">&gt;  </w:t>
-      </w:r>
-      <w:r>
-        <w:rPr>
-          <w:rFonts w:ascii="Segoe UI Emoji" w:hAnsi="Segoe UI Emoji" w:cs="Segoe UI Emoji"/>
-          <w:szCs w:val="24"/>
-        </w:rPr>
-        <w:t>🖥</w:t>
-      </w:r>
-      <w:proofErr w:type="gramEnd"/>
-      <w:r>
-        <w:rPr>
-          <w:rFonts w:ascii="Segoe UI Emoji" w:hAnsi="Segoe UI Emoji" w:cs="Segoe UI Emoji"/>
-          <w:szCs w:val="24"/>
-        </w:rPr>
-        <w:t>️</w:t>
-      </w:r>
-      <w:r>
-        <w:rPr>
-          <w:rFonts w:cs="Segoe UI Emoji"/>
-          <w:szCs w:val="24"/>
-        </w:rPr>
-        <w:t xml:space="preserve">   CYCLE TIME — MONTHLY AVG /</w:t>
-      </w:r>
-    </w:p>
-    <w:p>
-      <w:pPr>
-        <w:rPr>
-          <w:rFonts w:cs="Segoe UI Emoji"/>
-          <w:szCs w:val="24"/>
-        </w:rPr>
-      </w:pPr>
-      <w:r>
-        <w:rPr>
-          <w:rFonts w:cs="Segoe UI Emoji"/>
-          <w:szCs w:val="24"/>
-        </w:rPr>
-        <w:t xml:space="preserve">           &gt; </w:t>
-      </w:r>
-      <w:proofErr w:type="gramStart"/>
-      <w:r>
-        <w:rPr>
-          <w:rFonts w:ascii="Segoe UI Emoji" w:hAnsi="Segoe UI Emoji" w:cs="Segoe UI Emoji"/>
-          <w:szCs w:val="24"/>
-        </w:rPr>
-        <w:t>📊</w:t>
-      </w:r>
-      <w:r>
-        <w:rPr>
-          <w:rFonts w:cs="Segoe UI Emoji"/>
-          <w:szCs w:val="24"/>
-        </w:rPr>
-        <w:t xml:space="preserve">  CYCLE</w:t>
-      </w:r>
-      <w:proofErr w:type="gramEnd"/>
-      <w:r>
-        <w:rPr>
-          <w:rFonts w:cs="Segoe UI Emoji"/>
-          <w:szCs w:val="24"/>
-        </w:rPr>
-        <w:t xml:space="preserve"> TIME — MONTHLY AVG</w:t>
-      </w:r>
-    </w:p>
-    <w:p>
-      <w:pPr>
-        <w:rPr>
-          <w:rFonts w:cs="Segoe UI Emoji"/>
-          <w:szCs w:val="24"/>
-        </w:rPr>
-      </w:pPr>
-      <w:proofErr w:type="gramStart"/>
-      <w:r>
-        <w:rPr>
-          <w:rFonts w:cs="Arial"/>
-          <w:szCs w:val="24"/>
-        </w:rPr>
-        <w:t xml:space="preserve">&gt;  </w:t>
-      </w:r>
-      <w:r>
-        <w:rPr>
-          <w:rFonts w:ascii="Segoe UI Emoji" w:hAnsi="Segoe UI Emoji" w:cs="Segoe UI Emoji"/>
-          <w:szCs w:val="24"/>
-        </w:rPr>
-        <w:t>🖥</w:t>
-      </w:r>
-      <w:proofErr w:type="gramEnd"/>
-      <w:r>
-        <w:rPr>
-          <w:rFonts w:ascii="Segoe UI Emoji" w:hAnsi="Segoe UI Emoji" w:cs="Segoe UI Emoji"/>
-          <w:szCs w:val="24"/>
-        </w:rPr>
-        <w:t>️</w:t>
-      </w:r>
-      <w:r>
-        <w:rPr>
-          <w:rFonts w:cs="Segoe UI Emoji"/>
-          <w:szCs w:val="24"/>
-        </w:rPr>
-        <w:t xml:space="preserve">   MACHINE NG LOT RATE BY M/C /</w:t>
-      </w:r>
-    </w:p>
-    <w:p>
-      <w:pPr>
-        <w:rPr>
-          <w:rFonts w:cs="Segoe UI Emoji"/>
-          <w:szCs w:val="24"/>
-        </w:rPr>
-      </w:pPr>
-      <w:r>
-        <w:rPr>
-          <w:rFonts w:cs="Segoe UI Emoji"/>
-          <w:szCs w:val="24"/>
-        </w:rPr>
-        <w:t xml:space="preserve">           &gt; </w:t>
-      </w:r>
-      <w:proofErr w:type="gramStart"/>
-      <w:r>
-        <w:rPr>
-          <w:rFonts w:ascii="Segoe UI Emoji" w:hAnsi="Segoe UI Emoji" w:cs="Segoe UI Emoji"/>
-          <w:szCs w:val="24"/>
-        </w:rPr>
-        <w:t>📊</w:t>
-      </w:r>
-      <w:r>
-        <w:rPr>
-          <w:rFonts w:cs="Segoe UI Emoji"/>
-          <w:szCs w:val="24"/>
-        </w:rPr>
-        <w:t xml:space="preserve">  </w:t>
-      </w:r>
-      <w:r>
-        <w:rPr>
-          <w:rFonts w:cs="Segoe UI Emoji"/>
-          <w:szCs w:val="24"/>
-        </w:rPr>
-        <w:t>MACHINE</w:t>
-      </w:r>
-      <w:proofErr w:type="gramEnd"/>
-      <w:r>
-        <w:rPr>
-          <w:rFonts w:cs="Segoe UI Emoji"/>
-          <w:szCs w:val="24"/>
-        </w:rPr>
-        <w:t xml:space="preserve"> NG LOT RATE BY M/C</w:t>
+        <w:t>MACHINE NG LOT RATE BY M/C</w:t>
       </w:r>
     </w:p>
     <w:p>
@@ -16896,7 +17190,6 @@
         </w:rPr>
         <w:t xml:space="preserve">▼ </w:t>
       </w:r>
-      <w:proofErr w:type="gramStart"/>
       <w:r>
         <w:rPr>
           <w:rFonts w:ascii="Segoe UI Emoji" w:hAnsi="Segoe UI Emoji" w:cs="Segoe UI Emoji"/>
@@ -16909,37 +17202,79 @@
           <w:rFonts w:cs="Arial"/>
           <w:szCs w:val="24"/>
         </w:rPr>
-        <w:t xml:space="preserve">  D</w:t>
-      </w:r>
-      <w:proofErr w:type="gramEnd"/>
+        <w:t xml:space="preserve">  D4 — Traceability &amp; Record/ </w:t>
+      </w:r>
+    </w:p>
+    <w:p>
+      <w:pPr>
+        <w:rPr>
+          <w:rFonts w:cs="Segoe UI Emoji"/>
+          <w:szCs w:val="24"/>
+        </w:rPr>
+      </w:pPr>
       <w:r>
         <w:rPr>
           <w:rFonts w:cs="Arial"/>
           <w:szCs w:val="24"/>
         </w:rPr>
-        <w:t xml:space="preserve">4 — Traceability &amp; Record/ </w:t>
-      </w:r>
-    </w:p>
-    <w:p>
-      <w:pPr>
+        <w:t xml:space="preserve">  &gt;  </w:t>
+      </w:r>
+      <w:r>
+        <w:rPr>
+          <w:rFonts w:ascii="Segoe UI Emoji" w:hAnsi="Segoe UI Emoji" w:cs="Segoe UI Emoji"/>
+          <w:szCs w:val="24"/>
+        </w:rPr>
+        <w:t>🖥️</w:t>
+      </w:r>
+      <w:r>
         <w:rPr>
           <w:rFonts w:cs="Segoe UI Emoji"/>
           <w:szCs w:val="24"/>
         </w:rPr>
+        <w:t xml:space="preserve">   MATERIAL NG COUNT BY LOT /</w:t>
+      </w:r>
+    </w:p>
+    <w:p>
+      <w:pPr>
+        <w:rPr>
+          <w:rFonts w:cs="Segoe UI Emoji"/>
+          <w:szCs w:val="24"/>
+        </w:rPr>
+      </w:pPr>
+      <w:r>
+        <w:rPr>
+          <w:rFonts w:cs="Segoe UI Emoji"/>
+          <w:szCs w:val="24"/>
+        </w:rPr>
+        <w:t xml:space="preserve">           &gt; </w:t>
+      </w:r>
+      <w:r>
+        <w:rPr>
+          <w:rFonts w:ascii="Segoe UI Emoji" w:hAnsi="Segoe UI Emoji" w:cs="Segoe UI Emoji"/>
+          <w:szCs w:val="24"/>
+        </w:rPr>
+        <w:t>📊</w:t>
+      </w:r>
+      <w:r>
+        <w:rPr>
+          <w:rFonts w:cs="Segoe UI Emoji"/>
+          <w:szCs w:val="24"/>
+        </w:rPr>
+        <w:t xml:space="preserve">  MATERIAL NG COUNT BY LOT</w:t>
+      </w:r>
+    </w:p>
+    <w:p>
+      <w:pPr>
+        <w:rPr>
+          <w:rFonts w:cs="Segoe UI Emoji"/>
+          <w:szCs w:val="24"/>
+        </w:rPr>
       </w:pPr>
       <w:r>
         <w:rPr>
           <w:rFonts w:cs="Arial"/>
           <w:szCs w:val="24"/>
         </w:rPr>
-        <w:t xml:space="preserve">  </w:t>
-      </w:r>
-      <w:proofErr w:type="gramStart"/>
-      <w:r>
-        <w:rPr>
-          <w:rFonts w:cs="Arial"/>
-          <w:szCs w:val="24"/>
-        </w:rPr>
         <w:t xml:space="preserve">&gt;  </w:t>
       </w:r>
       <w:r>
@@ -16947,209 +17282,114 @@
           <w:rFonts w:ascii="Segoe UI Emoji" w:hAnsi="Segoe UI Emoji" w:cs="Segoe UI Emoji"/>
           <w:szCs w:val="24"/>
         </w:rPr>
-        <w:t>🖥</w:t>
-      </w:r>
-      <w:proofErr w:type="gramEnd"/>
+        <w:t>🖥️</w:t>
+      </w:r>
+      <w:r>
+        <w:rPr>
+          <w:rFonts w:cs="Segoe UI Emoji"/>
+          <w:szCs w:val="24"/>
+        </w:rPr>
+        <w:t xml:space="preserve">   NG RECORDS DETAILS/</w:t>
+      </w:r>
+    </w:p>
+    <w:p>
+      <w:pPr>
+        <w:rPr>
+          <w:rFonts w:cs="Segoe UI Emoji"/>
+          <w:szCs w:val="24"/>
+        </w:rPr>
+      </w:pPr>
+      <w:r>
+        <w:rPr>
+          <w:rFonts w:cs="Segoe UI Emoji"/>
+          <w:szCs w:val="24"/>
+        </w:rPr>
+        <w:t xml:space="preserve">           &gt; </w:t>
+      </w:r>
       <w:r>
         <w:rPr>
           <w:rFonts w:ascii="Segoe UI Emoji" w:hAnsi="Segoe UI Emoji" w:cs="Segoe UI Emoji"/>
           <w:szCs w:val="24"/>
         </w:rPr>
-        <w:t>️</w:t>
+        <w:t>📊</w:t>
       </w:r>
       <w:r>
         <w:rPr>
           <w:rFonts w:cs="Segoe UI Emoji"/>
           <w:szCs w:val="24"/>
         </w:rPr>
-        <w:t xml:space="preserve">   MATERIAL NG COUNT BY LOT /</w:t>
-      </w:r>
-    </w:p>
-    <w:p>
-      <w:pPr>
-        <w:rPr>
-          <w:rFonts w:cs="Segoe UI Emoji"/>
-          <w:szCs w:val="24"/>
-        </w:rPr>
-      </w:pPr>
-      <w:r>
-        <w:rPr>
-          <w:rFonts w:cs="Segoe UI Emoji"/>
-          <w:szCs w:val="24"/>
-        </w:rPr>
-        <w:t xml:space="preserve">           &gt; </w:t>
-      </w:r>
-      <w:proofErr w:type="gramStart"/>
-      <w:r>
-        <w:rPr>
-          <w:rFonts w:ascii="Segoe UI Emoji" w:hAnsi="Segoe UI Emoji" w:cs="Segoe UI Emoji"/>
-          <w:szCs w:val="24"/>
-        </w:rPr>
-        <w:t>📊</w:t>
-      </w:r>
-      <w:r>
-        <w:rPr>
-          <w:rFonts w:cs="Segoe UI Emoji"/>
-          <w:szCs w:val="24"/>
-        </w:rPr>
-        <w:t xml:space="preserve">  MATERIAL</w:t>
-      </w:r>
-      <w:proofErr w:type="gramEnd"/>
-      <w:r>
-        <w:rPr>
-          <w:rFonts w:cs="Segoe UI Emoji"/>
-          <w:szCs w:val="24"/>
-        </w:rPr>
-        <w:t xml:space="preserve"> NG COUNT BY LOT</w:t>
-      </w:r>
-    </w:p>
-    <w:p>
-      <w:pPr>
-        <w:rPr>
-          <w:rFonts w:cs="Segoe UI Emoji"/>
-          <w:szCs w:val="24"/>
-        </w:rPr>
-      </w:pPr>
-      <w:proofErr w:type="gramStart"/>
-      <w:r>
-        <w:rPr>
-          <w:rFonts w:cs="Arial"/>
-          <w:szCs w:val="24"/>
-        </w:rPr>
-        <w:t xml:space="preserve">&gt;  </w:t>
-      </w:r>
-      <w:r>
-        <w:rPr>
-          <w:rFonts w:ascii="Segoe UI Emoji" w:hAnsi="Segoe UI Emoji" w:cs="Segoe UI Emoji"/>
-          <w:szCs w:val="24"/>
-        </w:rPr>
-        <w:t>🖥</w:t>
-      </w:r>
-      <w:proofErr w:type="gramEnd"/>
-      <w:r>
-        <w:rPr>
-          <w:rFonts w:ascii="Segoe UI Emoji" w:hAnsi="Segoe UI Emoji" w:cs="Segoe UI Emoji"/>
-          <w:szCs w:val="24"/>
-        </w:rPr>
-        <w:t>️</w:t>
-      </w:r>
-      <w:r>
-        <w:rPr>
-          <w:rFonts w:cs="Segoe UI Emoji"/>
-          <w:szCs w:val="24"/>
-        </w:rPr>
-        <w:t xml:space="preserve">   NG RECORDS DETAILS/</w:t>
-      </w:r>
-    </w:p>
-    <w:p>
-      <w:pPr>
-        <w:rPr>
-          <w:rFonts w:cs="Segoe UI Emoji"/>
-          <w:szCs w:val="24"/>
-        </w:rPr>
-      </w:pPr>
-      <w:r>
-        <w:rPr>
-          <w:rFonts w:cs="Segoe UI Emoji"/>
-          <w:szCs w:val="24"/>
-        </w:rPr>
-        <w:t xml:space="preserve">           &gt; </w:t>
-      </w:r>
-      <w:proofErr w:type="gramStart"/>
-      <w:r>
-        <w:rPr>
-          <w:rFonts w:ascii="Segoe UI Emoji" w:hAnsi="Segoe UI Emoji" w:cs="Segoe UI Emoji"/>
-          <w:szCs w:val="24"/>
-        </w:rPr>
-        <w:t>📊</w:t>
-      </w:r>
-      <w:r>
-        <w:rPr>
-          <w:rFonts w:cs="Segoe UI Emoji"/>
-          <w:szCs w:val="24"/>
-        </w:rPr>
-        <w:t xml:space="preserve">  NG</w:t>
-      </w:r>
-      <w:proofErr w:type="gramEnd"/>
-      <w:r>
-        <w:rPr>
-          <w:rFonts w:cs="Segoe UI Emoji"/>
-          <w:szCs w:val="24"/>
-        </w:rPr>
-        <w:t xml:space="preserve"> RECORDS DETAILS</w:t>
-      </w:r>
-    </w:p>
-    <w:p>
-      <w:pPr>
-        <w:rPr>
-          <w:rFonts w:hint="cs"/>
-          <w:b/>
-          <w:bCs/>
-          <w:sz w:val="28"/>
-          <w:szCs w:val="28"/>
-        </w:rPr>
-      </w:pPr>
-    </w:p>
-    <w:p>
-      <w:pPr>
-        <w:rPr>
-          <w:sz w:val="28"/>
-          <w:szCs w:val="28"/>
-        </w:rPr>
-      </w:pPr>
-    </w:p>
-    <w:p>
-      <w:pPr>
-        <w:rPr>
-          <w:sz w:val="28"/>
-          <w:szCs w:val="28"/>
-        </w:rPr>
-      </w:pPr>
-    </w:p>
-    <w:p>
-      <w:pPr>
-        <w:rPr>
-          <w:sz w:val="28"/>
-          <w:szCs w:val="28"/>
-        </w:rPr>
-      </w:pPr>
-    </w:p>
-    <w:p>
-      <w:pPr>
-        <w:rPr>
-          <w:sz w:val="28"/>
-          <w:szCs w:val="28"/>
-        </w:rPr>
-      </w:pPr>
-    </w:p>
-    <w:p>
-      <w:pPr>
-        <w:rPr>
-          <w:sz w:val="28"/>
-          <w:szCs w:val="28"/>
-        </w:rPr>
-      </w:pPr>
-    </w:p>
-    <w:p>
-      <w:pPr>
-        <w:rPr>
-          <w:sz w:val="28"/>
-          <w:szCs w:val="28"/>
-        </w:rPr>
-      </w:pPr>
-    </w:p>
-    <w:p>
-      <w:pPr>
-        <w:rPr>
-          <w:sz w:val="28"/>
-          <w:szCs w:val="28"/>
-        </w:rPr>
-      </w:pPr>
-    </w:p>
-    <w:p>
-      <w:pPr>
-        <w:rPr>
-          <w:rFonts w:hint="cs"/>
+        <w:t xml:space="preserve">  NG RECORDS DETAILS</w:t>
+      </w:r>
+    </w:p>
+    <w:p>
+      <w:pPr>
+        <w:rPr>
+          <w:b/>
+          <w:bCs/>
+          <w:sz w:val="28"/>
+          <w:szCs w:val="28"/>
+        </w:rPr>
+      </w:pPr>
+    </w:p>
+    <w:p>
+      <w:pPr>
+        <w:rPr>
+          <w:sz w:val="28"/>
+          <w:szCs w:val="28"/>
+        </w:rPr>
+      </w:pPr>
+    </w:p>
+    <w:p>
+      <w:pPr>
+        <w:rPr>
+          <w:sz w:val="28"/>
+          <w:szCs w:val="28"/>
+        </w:rPr>
+      </w:pPr>
+    </w:p>
+    <w:p>
+      <w:pPr>
+        <w:rPr>
+          <w:sz w:val="28"/>
+          <w:szCs w:val="28"/>
+        </w:rPr>
+      </w:pPr>
+    </w:p>
+    <w:p>
+      <w:pPr>
+        <w:rPr>
+          <w:sz w:val="28"/>
+          <w:szCs w:val="28"/>
+        </w:rPr>
+      </w:pPr>
+    </w:p>
+    <w:p>
+      <w:pPr>
+        <w:rPr>
+          <w:sz w:val="28"/>
+          <w:szCs w:val="28"/>
+        </w:rPr>
+      </w:pPr>
+    </w:p>
+    <w:p>
+      <w:pPr>
+        <w:rPr>
+          <w:sz w:val="28"/>
+          <w:szCs w:val="28"/>
+        </w:rPr>
+      </w:pPr>
+    </w:p>
+    <w:p>
+      <w:pPr>
+        <w:rPr>
+          <w:sz w:val="28"/>
+          <w:szCs w:val="28"/>
+        </w:rPr>
+      </w:pPr>
+    </w:p>
+    <w:p>
+      <w:pPr>
+        <w:rPr>
           <w:b/>
           <w:bCs/>
           <w:sz w:val="28"/>
@@ -17174,13 +17414,19 @@
         </w:rPr>
         <w:tab/>
       </w:r>
-      <w:r>
-        <w:rPr>
-          <w:sz w:val="28"/>
-          <w:szCs w:val="28"/>
-        </w:rPr>
-        <w:br/>
-      </w:r>
+    </w:p>
+    <w:p>
+      <w:pPr>
+        <w:tabs>
+          <w:tab w:val="left" w:pos="2810"/>
+        </w:tabs>
+        <w:rPr>
+          <w:rFonts w:hint="cs"/>
+          <w:sz w:val="28"/>
+          <w:szCs w:val="28"/>
+          <w:cs/>
+        </w:rPr>
+      </w:pPr>
     </w:p>
     <w:p>
       <w:pPr>
@@ -17199,16 +17445,25 @@
           <w:szCs w:val="28"/>
         </w:rPr>
         <w:lastRenderedPageBreak/>
-        <w:t>1.1.</w:t>
-      </w:r>
-      <w:r>
-        <w:rPr>
-          <w:b/>
-          <w:bCs/>
-          <w:sz w:val="28"/>
-          <w:szCs w:val="28"/>
-        </w:rPr>
-        <w:t>9</w:t>
+        <w:t>2</w:t>
+      </w:r>
+      <w:r>
+        <w:rPr>
+          <w:b/>
+          <w:bCs/>
+          <w:sz w:val="28"/>
+          <w:szCs w:val="28"/>
+        </w:rPr>
+        <w:t>.1.</w:t>
+      </w:r>
+      <w:r>
+        <w:rPr>
+          <w:b/>
+          <w:bCs/>
+          <w:sz w:val="28"/>
+          <w:szCs w:val="28"/>
+        </w:rPr>
+        <w:t>11</w:t>
       </w:r>
       <w:r>
         <w:rPr>
@@ -17502,15 +17757,7 @@
                             </w:r>
                             <w:r>
                               <w:br/>
-                              <w:t xml:space="preserve">• ISC IS NOT NULL </w:t>
-                            </w:r>
-                            <w:proofErr w:type="gramStart"/>
-                            <w:r>
-                              <w:t>&amp; !</w:t>
-                            </w:r>
-                            <w:proofErr w:type="gramEnd"/>
-                            <w:r>
-                              <w:t>= ''</w:t>
+                              <w:t>• ISC IS NOT NULL &amp; != ''</w:t>
                             </w:r>
                             <w:r>
                               <w:br/>
@@ -17559,15 +17806,7 @@
                       </w:r>
                       <w:r>
                         <w:br/>
-                        <w:t xml:space="preserve">• ISC IS NOT NULL </w:t>
-                      </w:r>
-                      <w:proofErr w:type="gramStart"/>
-                      <w:r>
-                        <w:t>&amp; !</w:t>
-                      </w:r>
-                      <w:proofErr w:type="gramEnd"/>
-                      <w:r>
-                        <w:t>= ''</w:t>
+                        <w:t>• ISC IS NOT NULL &amp; != ''</w:t>
                       </w:r>
                       <w:r>
                         <w:br/>
@@ -18366,27 +18605,7 @@
                               <w:t xml:space="preserve">Step </w:t>
                             </w:r>
                             <w:r>
-                              <w:t>4</w:t>
-                            </w:r>
-                            <w:r>
-                              <w:rPr>
-                                <w:rFonts w:hint="cs"/>
-                                <w:cs/>
-                              </w:rPr>
-                              <w:t xml:space="preserve"> </w:t>
-                            </w:r>
-                            <w:r>
-                              <w:t>&amp;</w:t>
-                            </w:r>
-                            <w:r>
-                              <w:rPr>
-                                <w:rFonts w:hint="cs"/>
-                                <w:cs/>
-                              </w:rPr>
-                              <w:t xml:space="preserve"> </w:t>
-                            </w:r>
-                            <w:r>
-                              <w:t>5</w:t>
+                              <w:t>6</w:t>
                             </w:r>
                             <w:r>
                               <w:t xml:space="preserve">: </w:t>
@@ -18414,15 +18633,7 @@
                             </w:r>
                             <w:r>
                               <w:br/>
-                              <w:t>Vertical Bar Chart (</w:t>
-                            </w:r>
-                            <w:proofErr w:type="gramStart"/>
-                            <w:r>
-                              <w:t>Dark-Red</w:t>
-                            </w:r>
-                            <w:proofErr w:type="gramEnd"/>
-                            <w:r>
-                              <w:t>)</w:t>
+                              <w:t>Vertical Bar Chart (Dark-Red)</w:t>
                             </w:r>
                             <w:r>
                               <w:br/>
@@ -18478,27 +18689,7 @@
                         <w:t xml:space="preserve">Step </w:t>
                       </w:r>
                       <w:r>
-                        <w:t>4</w:t>
-                      </w:r>
-                      <w:r>
-                        <w:rPr>
-                          <w:rFonts w:hint="cs"/>
-                          <w:cs/>
-                        </w:rPr>
-                        <w:t xml:space="preserve"> </w:t>
-                      </w:r>
-                      <w:r>
-                        <w:t>&amp;</w:t>
-                      </w:r>
-                      <w:r>
-                        <w:rPr>
-                          <w:rFonts w:hint="cs"/>
-                          <w:cs/>
-                        </w:rPr>
-                        <w:t xml:space="preserve"> </w:t>
-                      </w:r>
-                      <w:r>
-                        <w:t>5</w:t>
+                        <w:t>6</w:t>
                       </w:r>
                       <w:r>
                         <w:t xml:space="preserve">: </w:t>
@@ -18526,15 +18717,7 @@
                       </w:r>
                       <w:r>
                         <w:br/>
-                        <w:t>Vertical Bar Chart (</w:t>
-                      </w:r>
-                      <w:proofErr w:type="gramStart"/>
-                      <w:r>
-                        <w:t>Dark-Red</w:t>
-                      </w:r>
-                      <w:proofErr w:type="gramEnd"/>
-                      <w:r>
-                        <w:t>)</w:t>
+                        <w:t>Vertical Bar Chart (Dark-Red)</w:t>
                       </w:r>
                       <w:r>
                         <w:br/>
@@ -18852,15 +19035,7 @@
                             <w:proofErr w:type="spellEnd"/>
                             <w:r>
                               <w:br/>
-                              <w:t xml:space="preserve">• </w:t>
-                            </w:r>
-                            <w:proofErr w:type="gramStart"/>
-                            <w:r>
-                              <w:t>COUNT(</w:t>
-                            </w:r>
-                            <w:proofErr w:type="gramEnd"/>
-                            <w:r>
-                              <w:t xml:space="preserve">*) AS </w:t>
+                              <w:t xml:space="preserve">• COUNT(*) AS </w:t>
                             </w:r>
                             <w:proofErr w:type="spellStart"/>
                             <w:r>
@@ -18869,15 +19044,7 @@
                             <w:proofErr w:type="spellEnd"/>
                             <w:r>
                               <w:br/>
-                              <w:t xml:space="preserve">• </w:t>
-                            </w:r>
-                            <w:proofErr w:type="gramStart"/>
-                            <w:r>
-                              <w:t>MAX(</w:t>
-                            </w:r>
-                            <w:proofErr w:type="gramEnd"/>
-                            <w:r>
-                              <w:t>) Metadata Fields</w:t>
+                              <w:t>• MAX() Metadata Fields</w:t>
                             </w:r>
                           </w:p>
                         </w:txbxContent>
@@ -18978,15 +19145,7 @@
                       <w:proofErr w:type="spellEnd"/>
                       <w:r>
                         <w:br/>
-                        <w:t xml:space="preserve">• </w:t>
-                      </w:r>
-                      <w:proofErr w:type="gramStart"/>
-                      <w:r>
-                        <w:t>COUNT(</w:t>
-                      </w:r>
-                      <w:proofErr w:type="gramEnd"/>
-                      <w:r>
-                        <w:t xml:space="preserve">*) AS </w:t>
+                        <w:t xml:space="preserve">• COUNT(*) AS </w:t>
                       </w:r>
                       <w:proofErr w:type="spellStart"/>
                       <w:r>
@@ -18995,15 +19154,7 @@
                       <w:proofErr w:type="spellEnd"/>
                       <w:r>
                         <w:br/>
-                        <w:t xml:space="preserve">• </w:t>
-                      </w:r>
-                      <w:proofErr w:type="gramStart"/>
-                      <w:r>
-                        <w:t>MAX(</w:t>
-                      </w:r>
-                      <w:proofErr w:type="gramEnd"/>
-                      <w:r>
-                        <w:t>) Metadata Fields</w:t>
+                        <w:t>• MAX() Metadata Fields</w:t>
                       </w:r>
                     </w:p>
                   </w:txbxContent>
@@ -19165,11 +19316,11 @@
                               <w:jc w:val="center"/>
                             </w:pPr>
                             <w:r>
-                              <w:t xml:space="preserve"> GROUP BY i</w:t>
+                              <w:t xml:space="preserve"> GROUP BY </w:t>
                             </w:r>
                             <w:proofErr w:type="spellStart"/>
                             <w:r>
-                              <w:t>sc_clean</w:t>
+                              <w:t>isc_clean</w:t>
                             </w:r>
                             <w:proofErr w:type="spellEnd"/>
                             <w:r>
@@ -19182,15 +19333,7 @@
                             <w:proofErr w:type="spellEnd"/>
                             <w:r>
                               <w:br/>
-                              <w:t xml:space="preserve">• </w:t>
-                            </w:r>
-                            <w:proofErr w:type="gramStart"/>
-                            <w:r>
-                              <w:t>COUNT(</w:t>
-                            </w:r>
-                            <w:proofErr w:type="gramEnd"/>
-                            <w:r>
-                              <w:t xml:space="preserve">*) AS </w:t>
+                              <w:t xml:space="preserve">• COUNT(*) AS </w:t>
                             </w:r>
                             <w:proofErr w:type="spellStart"/>
                             <w:r>
@@ -19199,15 +19342,7 @@
                             <w:proofErr w:type="spellEnd"/>
                             <w:r>
                               <w:br/>
-                              <w:t xml:space="preserve">• </w:t>
-                            </w:r>
-                            <w:proofErr w:type="gramStart"/>
-                            <w:r>
-                              <w:t>MAX(</w:t>
-                            </w:r>
-                            <w:proofErr w:type="gramEnd"/>
-                            <w:r>
-                              <w:t>) Metadata Fields</w:t>
+                              <w:t>• MAX() Metadata Fields</w:t>
                             </w:r>
                           </w:p>
                         </w:txbxContent>
@@ -19258,11 +19393,11 @@
                         <w:jc w:val="center"/>
                       </w:pPr>
                       <w:r>
-                        <w:t xml:space="preserve"> GROUP BY i</w:t>
+                        <w:t xml:space="preserve"> GROUP BY </w:t>
                       </w:r>
                       <w:proofErr w:type="spellStart"/>
                       <w:r>
-                        <w:t>sc_clean</w:t>
+                        <w:t>isc_clean</w:t>
                       </w:r>
                       <w:proofErr w:type="spellEnd"/>
                       <w:r>
@@ -19275,15 +19410,7 @@
                       <w:proofErr w:type="spellEnd"/>
                       <w:r>
                         <w:br/>
-                        <w:t xml:space="preserve">• </w:t>
-                      </w:r>
-                      <w:proofErr w:type="gramStart"/>
-                      <w:r>
-                        <w:t>COUNT(</w:t>
-                      </w:r>
-                      <w:proofErr w:type="gramEnd"/>
-                      <w:r>
-                        <w:t xml:space="preserve">*) AS </w:t>
+                        <w:t xml:space="preserve">• COUNT(*) AS </w:t>
                       </w:r>
                       <w:proofErr w:type="spellStart"/>
                       <w:r>
@@ -19292,15 +19419,7 @@
                       <w:proofErr w:type="spellEnd"/>
                       <w:r>
                         <w:br/>
-                        <w:t xml:space="preserve">• </w:t>
-                      </w:r>
-                      <w:proofErr w:type="gramStart"/>
-                      <w:r>
-                        <w:t>MAX(</w:t>
-                      </w:r>
-                      <w:proofErr w:type="gramEnd"/>
-                      <w:r>
-                        <w:t>) Metadata Fields</w:t>
+                        <w:t>• MAX() Metadata Fields</w:t>
                       </w:r>
                     </w:p>
                   </w:txbxContent>
@@ -19841,63 +19960,7 @@
         <w:rPr>
           <w:szCs w:val="24"/>
         </w:rPr>
-        <w:t xml:space="preserve"> database </w:t>
-      </w:r>
-      <w:proofErr w:type="gramStart"/>
-      <w:r>
-        <w:rPr>
-          <w:szCs w:val="24"/>
-        </w:rPr>
-        <w:t>fill:#</w:t>
-      </w:r>
-      <w:proofErr w:type="gramEnd"/>
-      <w:r>
-        <w:rPr>
-          <w:szCs w:val="24"/>
-        </w:rPr>
-        <w:t>2b5c8</w:t>
-      </w:r>
-      <w:proofErr w:type="gramStart"/>
-      <w:r>
-        <w:rPr>
-          <w:szCs w:val="24"/>
-        </w:rPr>
-        <w:t>f,stroke</w:t>
-      </w:r>
-      <w:proofErr w:type="gramEnd"/>
-      <w:r>
-        <w:rPr>
-          <w:szCs w:val="24"/>
-        </w:rPr>
-        <w:t>:#</w:t>
-      </w:r>
-      <w:proofErr w:type="gramStart"/>
-      <w:r>
-        <w:rPr>
-          <w:szCs w:val="24"/>
-        </w:rPr>
-        <w:t>fff,stroke</w:t>
-      </w:r>
-      <w:proofErr w:type="gramEnd"/>
-      <w:r>
-        <w:rPr>
-          <w:szCs w:val="24"/>
-        </w:rPr>
-        <w:t>-width:2</w:t>
-      </w:r>
-      <w:proofErr w:type="gramStart"/>
-      <w:r>
-        <w:rPr>
-          <w:szCs w:val="24"/>
-        </w:rPr>
-        <w:t>px,color</w:t>
-      </w:r>
-      <w:proofErr w:type="gramEnd"/>
-      <w:r>
-        <w:rPr>
-          <w:szCs w:val="24"/>
-        </w:rPr>
-        <w:t>:#</w:t>
+        <w:t xml:space="preserve"> database fill:#2b5c8f,stroke:#fff,stroke-width:2px,color:#</w:t>
       </w:r>
       <w:proofErr w:type="spellStart"/>
       <w:r>
@@ -19941,63 +20004,7 @@
         <w:rPr>
           <w:szCs w:val="24"/>
         </w:rPr>
-        <w:t xml:space="preserve"> filter </w:t>
-      </w:r>
-      <w:proofErr w:type="gramStart"/>
-      <w:r>
-        <w:rPr>
-          <w:szCs w:val="24"/>
-        </w:rPr>
-        <w:t>fill:#</w:t>
-      </w:r>
-      <w:proofErr w:type="gramEnd"/>
-      <w:r>
-        <w:rPr>
-          <w:szCs w:val="24"/>
-        </w:rPr>
-        <w:t>d</w:t>
-      </w:r>
-      <w:proofErr w:type="gramStart"/>
-      <w:r>
-        <w:rPr>
-          <w:szCs w:val="24"/>
-        </w:rPr>
-        <w:t>97706,stroke</w:t>
-      </w:r>
-      <w:proofErr w:type="gramEnd"/>
-      <w:r>
-        <w:rPr>
-          <w:szCs w:val="24"/>
-        </w:rPr>
-        <w:t>:#</w:t>
-      </w:r>
-      <w:proofErr w:type="gramStart"/>
-      <w:r>
-        <w:rPr>
-          <w:szCs w:val="24"/>
-        </w:rPr>
-        <w:t>fff,stroke</w:t>
-      </w:r>
-      <w:proofErr w:type="gramEnd"/>
-      <w:r>
-        <w:rPr>
-          <w:szCs w:val="24"/>
-        </w:rPr>
-        <w:t>-width:2</w:t>
-      </w:r>
-      <w:proofErr w:type="gramStart"/>
-      <w:r>
-        <w:rPr>
-          <w:szCs w:val="24"/>
-        </w:rPr>
-        <w:t>px,color</w:t>
-      </w:r>
-      <w:proofErr w:type="gramEnd"/>
-      <w:r>
-        <w:rPr>
-          <w:szCs w:val="24"/>
-        </w:rPr>
-        <w:t>:#</w:t>
+        <w:t xml:space="preserve"> filter fill:#d97706,stroke:#fff,stroke-width:2px,color:#</w:t>
       </w:r>
       <w:proofErr w:type="spellStart"/>
       <w:r>
@@ -20041,49 +20048,7 @@
         <w:rPr>
           <w:szCs w:val="24"/>
         </w:rPr>
-        <w:t xml:space="preserve"> process </w:t>
-      </w:r>
-      <w:proofErr w:type="gramStart"/>
-      <w:r>
-        <w:rPr>
-          <w:szCs w:val="24"/>
-        </w:rPr>
-        <w:t>fill:#059669,stroke</w:t>
-      </w:r>
-      <w:proofErr w:type="gramEnd"/>
-      <w:r>
-        <w:rPr>
-          <w:szCs w:val="24"/>
-        </w:rPr>
-        <w:t>:#</w:t>
-      </w:r>
-      <w:proofErr w:type="gramStart"/>
-      <w:r>
-        <w:rPr>
-          <w:szCs w:val="24"/>
-        </w:rPr>
-        <w:t>fff,stroke</w:t>
-      </w:r>
-      <w:proofErr w:type="gramEnd"/>
-      <w:r>
-        <w:rPr>
-          <w:szCs w:val="24"/>
-        </w:rPr>
-        <w:t>-width:2</w:t>
-      </w:r>
-      <w:proofErr w:type="gramStart"/>
-      <w:r>
-        <w:rPr>
-          <w:szCs w:val="24"/>
-        </w:rPr>
-        <w:t>px,color</w:t>
-      </w:r>
-      <w:proofErr w:type="gramEnd"/>
-      <w:r>
-        <w:rPr>
-          <w:szCs w:val="24"/>
-        </w:rPr>
-        <w:t>:#</w:t>
+        <w:t xml:space="preserve"> process fill:#059669,stroke:#fff,stroke-width:2px,color:#</w:t>
       </w:r>
       <w:proofErr w:type="spellStart"/>
       <w:r>
@@ -20127,63 +20092,7 @@
         <w:rPr>
           <w:szCs w:val="24"/>
         </w:rPr>
-        <w:t xml:space="preserve"> aggregate </w:t>
-      </w:r>
-      <w:proofErr w:type="gramStart"/>
-      <w:r>
-        <w:rPr>
-          <w:szCs w:val="24"/>
-        </w:rPr>
-        <w:t>fill:#</w:t>
-      </w:r>
-      <w:proofErr w:type="gramEnd"/>
-      <w:r>
-        <w:rPr>
-          <w:szCs w:val="24"/>
-        </w:rPr>
-        <w:t>7c3</w:t>
-      </w:r>
-      <w:proofErr w:type="gramStart"/>
-      <w:r>
-        <w:rPr>
-          <w:szCs w:val="24"/>
-        </w:rPr>
-        <w:t>aed,stroke</w:t>
-      </w:r>
-      <w:proofErr w:type="gramEnd"/>
-      <w:r>
-        <w:rPr>
-          <w:szCs w:val="24"/>
-        </w:rPr>
-        <w:t>:#</w:t>
-      </w:r>
-      <w:proofErr w:type="gramStart"/>
-      <w:r>
-        <w:rPr>
-          <w:szCs w:val="24"/>
-        </w:rPr>
-        <w:t>fff,stroke</w:t>
-      </w:r>
-      <w:proofErr w:type="gramEnd"/>
-      <w:r>
-        <w:rPr>
-          <w:szCs w:val="24"/>
-        </w:rPr>
-        <w:t>-width:2</w:t>
-      </w:r>
-      <w:proofErr w:type="gramStart"/>
-      <w:r>
-        <w:rPr>
-          <w:szCs w:val="24"/>
-        </w:rPr>
-        <w:t>px,color</w:t>
-      </w:r>
-      <w:proofErr w:type="gramEnd"/>
-      <w:r>
-        <w:rPr>
-          <w:szCs w:val="24"/>
-        </w:rPr>
-        <w:t>:#</w:t>
+        <w:t xml:space="preserve"> aggregate fill:#7c3aed,stroke:#fff,stroke-width:2px,color:#</w:t>
       </w:r>
       <w:proofErr w:type="spellStart"/>
       <w:r>
@@ -20227,63 +20136,7 @@
         <w:rPr>
           <w:szCs w:val="24"/>
         </w:rPr>
-        <w:t xml:space="preserve"> visual </w:t>
-      </w:r>
-      <w:proofErr w:type="gramStart"/>
-      <w:r>
-        <w:rPr>
-          <w:szCs w:val="24"/>
-        </w:rPr>
-        <w:t>fill:#</w:t>
-      </w:r>
-      <w:proofErr w:type="gramEnd"/>
-      <w:r>
-        <w:rPr>
-          <w:szCs w:val="24"/>
-        </w:rPr>
-        <w:t>dc</w:t>
-      </w:r>
-      <w:proofErr w:type="gramStart"/>
-      <w:r>
-        <w:rPr>
-          <w:szCs w:val="24"/>
-        </w:rPr>
-        <w:t>2626,stroke</w:t>
-      </w:r>
-      <w:proofErr w:type="gramEnd"/>
-      <w:r>
-        <w:rPr>
-          <w:szCs w:val="24"/>
-        </w:rPr>
-        <w:t>:#</w:t>
-      </w:r>
-      <w:proofErr w:type="gramStart"/>
-      <w:r>
-        <w:rPr>
-          <w:szCs w:val="24"/>
-        </w:rPr>
-        <w:t>fff,stroke</w:t>
-      </w:r>
-      <w:proofErr w:type="gramEnd"/>
-      <w:r>
-        <w:rPr>
-          <w:szCs w:val="24"/>
-        </w:rPr>
-        <w:t>-width:2</w:t>
-      </w:r>
-      <w:proofErr w:type="gramStart"/>
-      <w:r>
-        <w:rPr>
-          <w:szCs w:val="24"/>
-        </w:rPr>
-        <w:t>px,color</w:t>
-      </w:r>
-      <w:proofErr w:type="gramEnd"/>
-      <w:r>
-        <w:rPr>
-          <w:szCs w:val="24"/>
-        </w:rPr>
-        <w:t>:#</w:t>
+        <w:t xml:space="preserve"> visual fill:#dc2626,stroke:#fff,stroke-width:2px,color:#</w:t>
       </w:r>
       <w:proofErr w:type="spellStart"/>
       <w:r>
@@ -20339,21 +20192,7 @@
         <w:rPr>
           <w:szCs w:val="24"/>
         </w:rPr>
-        <w:t xml:space="preserve">    </w:t>
-      </w:r>
-      <w:proofErr w:type="gramStart"/>
-      <w:r>
-        <w:rPr>
-          <w:szCs w:val="24"/>
-        </w:rPr>
-        <w:t>DB[</w:t>
-      </w:r>
-      <w:proofErr w:type="gramEnd"/>
-      <w:r>
-        <w:rPr>
-          <w:szCs w:val="24"/>
-        </w:rPr>
-        <w:t>("</w:t>
+        <w:t xml:space="preserve">    DB[("</w:t>
       </w:r>
       <w:proofErr w:type="spellStart"/>
       <w:r>
@@ -20395,21 +20234,7 @@
         <w:rPr>
           <w:szCs w:val="24"/>
         </w:rPr>
-        <w:t>]</w:t>
-      </w:r>
-      <w:proofErr w:type="gramStart"/>
-      <w:r>
-        <w:rPr>
-          <w:szCs w:val="24"/>
-        </w:rPr>
-        <w:t>")]:::</w:t>
-      </w:r>
-      <w:proofErr w:type="gramEnd"/>
-      <w:r>
-        <w:rPr>
-          <w:szCs w:val="24"/>
-        </w:rPr>
-        <w:t>database</w:t>
+        <w:t>]")]:::database</w:t>
       </w:r>
     </w:p>
     <w:p>
@@ -20495,21 +20320,7 @@
         <w:rPr>
           <w:szCs w:val="24"/>
         </w:rPr>
-        <w:t xml:space="preserve">/&gt;• ISC IS NOT NULL </w:t>
-      </w:r>
-      <w:proofErr w:type="gramStart"/>
-      <w:r>
-        <w:rPr>
-          <w:szCs w:val="24"/>
-        </w:rPr>
-        <w:t>&amp; !</w:t>
-      </w:r>
-      <w:proofErr w:type="gramEnd"/>
-      <w:r>
-        <w:rPr>
-          <w:szCs w:val="24"/>
-        </w:rPr>
-        <w:t>= ''&lt;</w:t>
+        <w:t>/&gt;• ISC IS NOT NULL &amp; != ''&lt;</w:t>
       </w:r>
       <w:proofErr w:type="spellStart"/>
       <w:r>
@@ -20523,17 +20334,9 @@
         <w:rPr>
           <w:szCs w:val="24"/>
         </w:rPr>
-        <w:t xml:space="preserve">/&gt;• Judgement [S] = 'X' (NG </w:t>
-      </w:r>
-      <w:proofErr w:type="gramStart"/>
-      <w:r>
-        <w:rPr>
-          <w:szCs w:val="24"/>
-        </w:rPr>
-        <w:t>Only)&lt;</w:t>
+        <w:t>/&gt;• Judgement [S] = 'X' (NG Only)&lt;</w:t>
       </w:r>
       <w:proofErr w:type="spellStart"/>
-      <w:proofErr w:type="gramEnd"/>
       <w:r>
         <w:rPr>
           <w:szCs w:val="24"/>
@@ -20545,21 +20348,7 @@
         <w:rPr>
           <w:szCs w:val="24"/>
         </w:rPr>
-        <w:t>/&gt;• Dynamic Filters: Year, Month, Mold, M/C, Part No."</w:t>
-      </w:r>
-      <w:proofErr w:type="gramStart"/>
-      <w:r>
-        <w:rPr>
-          <w:szCs w:val="24"/>
-        </w:rPr>
-        <w:t>]:::</w:t>
-      </w:r>
-      <w:proofErr w:type="gramEnd"/>
-      <w:r>
-        <w:rPr>
-          <w:szCs w:val="24"/>
-        </w:rPr>
-        <w:t>filter</w:t>
+        <w:t>/&gt;• Dynamic Filters: Year, Month, Mold, M/C, Part No."]:::filter</w:t>
       </w:r>
     </w:p>
     <w:p>
@@ -20647,17 +20436,9 @@
         <w:rPr>
           <w:szCs w:val="24"/>
         </w:rPr>
-        <w:t>/&gt;Identical ID, QC Member, Mold, M/</w:t>
-      </w:r>
-      <w:proofErr w:type="gramStart"/>
-      <w:r>
-        <w:rPr>
-          <w:szCs w:val="24"/>
-        </w:rPr>
-        <w:t>C,&lt;</w:t>
+        <w:t>/&gt;Identical ID, QC Member, Mold, M/C,&lt;</w:t>
       </w:r>
       <w:proofErr w:type="spellStart"/>
-      <w:proofErr w:type="gramEnd"/>
       <w:r>
         <w:rPr>
           <w:szCs w:val="24"/>
@@ -20683,35 +20464,7 @@
         <w:rPr>
           <w:szCs w:val="24"/>
         </w:rPr>
-        <w:t>/</w:t>
-      </w:r>
-      <w:proofErr w:type="gramStart"/>
-      <w:r>
-        <w:rPr>
-          <w:szCs w:val="24"/>
-        </w:rPr>
-        <w:t>&gt;(</w:t>
-      </w:r>
-      <w:proofErr w:type="gramEnd"/>
-      <w:r>
-        <w:rPr>
-          <w:szCs w:val="24"/>
-        </w:rPr>
-        <w:t>Prevents Double Counting)"</w:t>
-      </w:r>
-      <w:proofErr w:type="gramStart"/>
-      <w:r>
-        <w:rPr>
-          <w:szCs w:val="24"/>
-        </w:rPr>
-        <w:t>]:::</w:t>
-      </w:r>
-      <w:proofErr w:type="gramEnd"/>
-      <w:r>
-        <w:rPr>
-          <w:szCs w:val="24"/>
-        </w:rPr>
-        <w:t>process</w:t>
+        <w:t>/&gt;(Prevents Double Counting)"]:::process</w:t>
       </w:r>
     </w:p>
     <w:p>
@@ -20838,21 +20591,7 @@
         <w:rPr>
           <w:szCs w:val="24"/>
         </w:rPr>
-        <w:t xml:space="preserve">/&gt;• </w:t>
-      </w:r>
-      <w:proofErr w:type="gramStart"/>
-      <w:r>
-        <w:rPr>
-          <w:szCs w:val="24"/>
-        </w:rPr>
-        <w:t>COUNT(</w:t>
-      </w:r>
-      <w:proofErr w:type="gramEnd"/>
-      <w:r>
-        <w:rPr>
-          <w:szCs w:val="24"/>
-        </w:rPr>
-        <w:t xml:space="preserve">*) AS </w:t>
+        <w:t xml:space="preserve">/&gt;• COUNT(*) AS </w:t>
       </w:r>
       <w:proofErr w:type="spellStart"/>
       <w:r>
@@ -20880,35 +20619,7 @@
         <w:rPr>
           <w:szCs w:val="24"/>
         </w:rPr>
-        <w:t xml:space="preserve">/&gt;• </w:t>
-      </w:r>
-      <w:proofErr w:type="gramStart"/>
-      <w:r>
-        <w:rPr>
-          <w:szCs w:val="24"/>
-        </w:rPr>
-        <w:t>MAX(</w:t>
-      </w:r>
-      <w:proofErr w:type="gramEnd"/>
-      <w:r>
-        <w:rPr>
-          <w:szCs w:val="24"/>
-        </w:rPr>
-        <w:t>) Metadata Fields"</w:t>
-      </w:r>
-      <w:proofErr w:type="gramStart"/>
-      <w:r>
-        <w:rPr>
-          <w:szCs w:val="24"/>
-        </w:rPr>
-        <w:t>]:::</w:t>
-      </w:r>
-      <w:proofErr w:type="gramEnd"/>
-      <w:r>
-        <w:rPr>
-          <w:szCs w:val="24"/>
-        </w:rPr>
-        <w:t>aggregate</w:t>
+        <w:t>/&gt;• MAX() Metadata Fields"]:::aggregate</w:t>
       </w:r>
     </w:p>
     <w:p>
@@ -21010,29 +20721,14 @@
         <w:rPr>
           <w:szCs w:val="24"/>
         </w:rPr>
-        <w:t xml:space="preserve">/&gt;• Y-Axis: </w:t>
-      </w:r>
-      <w:proofErr w:type="gramStart"/>
-      <w:r>
-        <w:rPr>
-          <w:szCs w:val="24"/>
-        </w:rPr>
-        <w:t>SUM(</w:t>
+        <w:t>/&gt;• Y-Axis: SUM(</w:t>
       </w:r>
       <w:proofErr w:type="spellStart"/>
-      <w:proofErr w:type="gramEnd"/>
-      <w:r>
-        <w:rPr>
-          <w:szCs w:val="24"/>
-        </w:rPr>
-        <w:t>ng_count_by_</w:t>
-      </w:r>
-      <w:proofErr w:type="gramStart"/>
-      <w:r>
-        <w:rPr>
-          <w:szCs w:val="24"/>
-        </w:rPr>
-        <w:t>cavity</w:t>
+      <w:r>
+        <w:rPr>
+          <w:szCs w:val="24"/>
+        </w:rPr>
+        <w:t>ng_count_by_cavity</w:t>
       </w:r>
       <w:proofErr w:type="spellEnd"/>
       <w:r>
@@ -21042,7 +20738,6 @@
         <w:t>)&lt;</w:t>
       </w:r>
       <w:proofErr w:type="spellStart"/>
-      <w:proofErr w:type="gramEnd"/>
       <w:r>
         <w:rPr>
           <w:szCs w:val="24"/>
@@ -21054,31 +20749,9 @@
         <w:rPr>
           <w:szCs w:val="24"/>
         </w:rPr>
-        <w:t>/&gt;• Tooltip: STRING_</w:t>
-      </w:r>
-      <w:proofErr w:type="gramStart"/>
-      <w:r>
-        <w:rPr>
-          <w:szCs w:val="24"/>
-        </w:rPr>
-        <w:t>AGG(</w:t>
-      </w:r>
-      <w:proofErr w:type="gramEnd"/>
-      <w:r>
-        <w:rPr>
-          <w:szCs w:val="24"/>
-        </w:rPr>
-        <w:t xml:space="preserve">Cavity </w:t>
-      </w:r>
-      <w:proofErr w:type="gramStart"/>
-      <w:r>
-        <w:rPr>
-          <w:szCs w:val="24"/>
-        </w:rPr>
-        <w:t>Breakdown)&lt;</w:t>
+        <w:t>/&gt;• Tooltip: STRING_AGG(Cavity Breakdown)&lt;</w:t>
       </w:r>
       <w:proofErr w:type="spellStart"/>
-      <w:proofErr w:type="gramEnd"/>
       <w:r>
         <w:rPr>
           <w:szCs w:val="24"/>
@@ -21104,21 +20777,7 @@
         <w:rPr>
           <w:szCs w:val="24"/>
         </w:rPr>
-        <w:t xml:space="preserve"> ASC"</w:t>
-      </w:r>
-      <w:proofErr w:type="gramStart"/>
-      <w:r>
-        <w:rPr>
-          <w:szCs w:val="24"/>
-        </w:rPr>
-        <w:t>]:::</w:t>
-      </w:r>
-      <w:proofErr w:type="gramEnd"/>
-      <w:r>
-        <w:rPr>
-          <w:szCs w:val="24"/>
-        </w:rPr>
-        <w:t>aggregate</w:t>
+        <w:t xml:space="preserve"> ASC"]:::aggregate</w:t>
       </w:r>
     </w:p>
     <w:p>
@@ -21192,21 +20851,7 @@
         <w:rPr>
           <w:szCs w:val="24"/>
         </w:rPr>
-        <w:t xml:space="preserve">        </w:t>
-      </w:r>
-      <w:proofErr w:type="gramStart"/>
-      <w:r>
-        <w:rPr>
-          <w:szCs w:val="24"/>
-        </w:rPr>
-        <w:t>PANEL[</w:t>
-      </w:r>
-      <w:proofErr w:type="gramEnd"/>
-      <w:r>
-        <w:rPr>
-          <w:szCs w:val="24"/>
-        </w:rPr>
-        <w:t>"JUDGEMENT BY ISC CODE&lt;</w:t>
+        <w:t xml:space="preserve">        PANEL["JUDGEMENT BY ISC CODE&lt;</w:t>
       </w:r>
       <w:proofErr w:type="spellStart"/>
       <w:r>
@@ -21220,17 +20865,9 @@
         <w:rPr>
           <w:szCs w:val="24"/>
         </w:rPr>
-        <w:t>/&gt;Vertical Bar Chart (Dark-</w:t>
-      </w:r>
-      <w:proofErr w:type="gramStart"/>
-      <w:r>
-        <w:rPr>
-          <w:szCs w:val="24"/>
-        </w:rPr>
-        <w:t>Red)&lt;</w:t>
+        <w:t>/&gt;Vertical Bar Chart (Dark-Red)&lt;</w:t>
       </w:r>
       <w:proofErr w:type="spellStart"/>
-      <w:proofErr w:type="gramEnd"/>
       <w:r>
         <w:rPr>
           <w:szCs w:val="24"/>
@@ -21256,17 +20893,9 @@
         <w:rPr>
           <w:szCs w:val="24"/>
         </w:rPr>
-        <w:t xml:space="preserve">, </w:t>
-      </w:r>
-      <w:proofErr w:type="gramStart"/>
-      <w:r>
-        <w:rPr>
-          <w:szCs w:val="24"/>
-        </w:rPr>
-        <w:t>Cy)&lt;</w:t>
+        <w:t>, Cy)&lt;</w:t>
       </w:r>
       <w:proofErr w:type="spellStart"/>
-      <w:proofErr w:type="gramEnd"/>
       <w:r>
         <w:rPr>
           <w:szCs w:val="24"/>
@@ -21292,21 +20921,7 @@
         <w:rPr>
           <w:szCs w:val="24"/>
         </w:rPr>
-        <w:t>/&gt;• Hover = Cavity Breakdown Details"</w:t>
-      </w:r>
-      <w:proofErr w:type="gramStart"/>
-      <w:r>
-        <w:rPr>
-          <w:szCs w:val="24"/>
-        </w:rPr>
-        <w:t>]:::</w:t>
-      </w:r>
-      <w:proofErr w:type="gramEnd"/>
-      <w:r>
-        <w:rPr>
-          <w:szCs w:val="24"/>
-        </w:rPr>
-        <w:t>visual</w:t>
+        <w:t>/&gt;• Hover = Cavity Breakdown Details"]:::visual</w:t>
       </w:r>
     </w:p>
     <w:p>

</xml_diff>